<commit_message>
Rôle 1 : partie condensée à 1 page
</commit_message>
<xml_diff>
--- a/Compte_rendu_projet_HPC.docx
+++ b/Compte_rendu_projet_HPC.docx
@@ -813,7 +813,7 @@
         <w:rPr>
           <w:rFonts w:ascii="Calibri" w:cs="Calibri" w:eastAsia="Calibri" w:hAnsi="Calibri"/>
         </w:rPr>
-        <w:t xml:space="preserve">le tableau comparatif final (section 7) doit être rempli sur une seule et même machine, sinon les speedups ne sont pas comparables.</w:t>
+        <w:t xml:space="preserve">le tableau comparatif final (section 6) doit être rempli sur une seule et même machine, sinon les speedups ne sont pas comparables.</w:t>
       </w:r>
     </w:p>
     <w:p>
@@ -2980,7 +2980,7 @@
         <w:rPr>
           <w:rFonts w:ascii="Calibri" w:cs="Calibri" w:eastAsia="Calibri" w:hAnsi="Calibri"/>
         </w:rPr>
-        <w:t xml:space="preserve">2. Partie 1 – Baseline et profilage (Rôle 1)</w:t>
+        <w:t xml:space="preserve">2. Parties 1 et 2 – Baseline, profilage et vectorisation (Rôle 1)</w:t>
       </w:r>
     </w:p>
     <w:p>
@@ -2991,18 +2991,20 @@
         <w:rPr>
           <w:rFonts w:ascii="Calibri" w:cs="Calibri" w:eastAsia="Calibri" w:hAnsi="Calibri"/>
         </w:rPr>
-        <w:t xml:space="preserve">2.1 Temps de référence T₁</w:t>
-      </w:r>
-    </w:p>
-    <w:p>
-      <w:pPr>
-        <w:spacing w:after="120" w:line="276"/>
-      </w:pPr>
-      <w:r>
-        <w:rPr>
-          <w:rFonts w:ascii="Calibri" w:cs="Calibri" w:eastAsia="Calibri" w:hAnsi="Calibri"/>
-        </w:rPr>
-        <w:t xml:space="preserve">Le programme séquentiel a été exécuté trois fois sur le PC portable de Loïs avec </w:t>
+        <w:t xml:space="preserve">2.1 Baseline et profilage</w:t>
+      </w:r>
+    </w:p>
+    <w:p>
+      <w:pPr>
+        <w:spacing w:after="80" w:line="260"/>
+      </w:pPr>
+      <w:r>
+        <w:rPr>
+          <w:rFonts w:ascii="Calibri" w:cs="Calibri" w:eastAsia="Calibri" w:hAnsi="Calibri"/>
+          <w:sz w:val="20"/>
+          <w:szCs w:val="20"/>
+        </w:rPr>
+        <w:t xml:space="preserve">Sur le PC de mesure (Intel Core 11e gén., 4 cœurs / 8 threads, 16 Go), trois exécutions de </w:t>
       </w:r>
       <w:r>
         <w:rPr>
@@ -3011,13 +3013,33 @@
           <w:sz w:val="20"/>
           <w:szCs w:val="20"/>
         </w:rPr>
-        <w:t xml:space="preserve">python sequential_pipeline.py</w:t>
-      </w:r>
-      <w:r>
-        <w:rPr>
-          <w:rFonts w:ascii="Calibri" w:cs="Calibri" w:eastAsia="Calibri" w:hAnsi="Calibri"/>
-        </w:rPr>
-        <w:t xml:space="preserve">.</w:t>
+        <w:t xml:space="preserve">sequential_pipeline.py</w:t>
+      </w:r>
+      <w:r>
+        <w:rPr>
+          <w:rFonts w:ascii="Calibri" w:cs="Calibri" w:eastAsia="Calibri" w:hAnsi="Calibri"/>
+          <w:sz w:val="20"/>
+          <w:szCs w:val="20"/>
+        </w:rPr>
+        <w:t xml:space="preserve"> donnent 2,840 / 2,725 / 2,839 s, soit </w:t>
+      </w:r>
+      <w:r>
+        <w:rPr>
+          <w:rFonts w:ascii="Calibri" w:cs="Calibri" w:eastAsia="Calibri" w:hAnsi="Calibri"/>
+          <w:b/>
+          <w:bCs/>
+          <w:sz w:val="20"/>
+          <w:szCs w:val="20"/>
+        </w:rPr>
+        <w:t xml:space="preserve">T₁ = 2,84 s</w:t>
+      </w:r>
+      <w:r>
+        <w:rPr>
+          <w:rFonts w:ascii="Calibri" w:cs="Calibri" w:eastAsia="Calibri" w:hAnsi="Calibri"/>
+          <w:sz w:val="20"/>
+          <w:szCs w:val="20"/>
+        </w:rPr>
+        <w:t xml:space="preserve"> (médiane, écart ≈ 4 %), avec un résumé global identique à chaque fois. Le profilage cProfile (proportions uniquement : le profileur ralentit l'exécution à 5,1 s) donne :</w:t>
       </w:r>
     </w:p>
     <w:tbl>
@@ -3033,9 +3055,10 @@
         </w:tblBorders>
       </w:tblPr>
       <w:tblGrid>
-        <w:gridCol w:w="3200"/>
-        <w:gridCol w:w="3200"/>
-        <w:gridCol w:w="3238"/>
+        <w:gridCol w:w="3300"/>
+        <w:gridCol w:w="1500"/>
+        <w:gridCol w:w="2400"/>
+        <w:gridCol w:w="2438"/>
       </w:tblGrid>
       <w:tr>
         <w:trPr>
@@ -3043,7 +3066,7 @@
         </w:trPr>
         <w:tc>
           <w:tcPr>
-            <w:tcW w:type="dxa" w:w="3200"/>
+            <w:tcW w:type="dxa" w:w="3300"/>
             <w:tcBorders>
               <w:top w:val="single" w:color="BFBFBF" w:sz="4"/>
               <w:left w:val="single" w:color="BFBFBF" w:sz="4"/>
@@ -3060,7 +3083,7 @@
           </w:tcPr>
           <w:p>
             <w:pPr>
-              <w:jc w:val="center"/>
+              <w:jc w:val="left"/>
             </w:pPr>
             <w:r>
               <w:rPr>
@@ -3071,13 +3094,13 @@
                 <w:sz w:val="20"/>
                 <w:szCs w:val="20"/>
               </w:rPr>
-              <w:t xml:space="preserve">Exécution</w:t>
-            </w:r>
-          </w:p>
-        </w:tc>
-        <w:tc>
-          <w:tcPr>
-            <w:tcW w:type="dxa" w:w="3200"/>
+              <w:t xml:space="preserve">Fonction (24 appels chacune)</w:t>
+            </w:r>
+          </w:p>
+        </w:tc>
+        <w:tc>
+          <w:tcPr>
+            <w:tcW w:type="dxa" w:w="1500"/>
             <w:tcBorders>
               <w:top w:val="single" w:color="BFBFBF" w:sz="4"/>
               <w:left w:val="single" w:color="BFBFBF" w:sz="4"/>
@@ -3105,13 +3128,13 @@
                 <w:sz w:val="20"/>
                 <w:szCs w:val="20"/>
               </w:rPr>
-              <w:t xml:space="preserve">Temps (s)</w:t>
-            </w:r>
-          </w:p>
-        </w:tc>
-        <w:tc>
-          <w:tcPr>
-            <w:tcW w:type="dxa" w:w="3238"/>
+              <w:t xml:space="preserve">Part du temps</w:t>
+            </w:r>
+          </w:p>
+        </w:tc>
+        <w:tc>
+          <w:tcPr>
+            <w:tcW w:type="dxa" w:w="2400"/>
             <w:tcBorders>
               <w:top w:val="single" w:color="BFBFBF" w:sz="4"/>
               <w:left w:val="single" w:color="BFBFBF" w:sz="4"/>
@@ -3139,478 +3162,13 @@
                 <w:sz w:val="20"/>
                 <w:szCs w:val="20"/>
               </w:rPr>
-              <w:t xml:space="preserve">Résumé global</w:t>
-            </w:r>
-          </w:p>
-        </w:tc>
-      </w:tr>
-      <w:tr>
-        <w:tc>
-          <w:tcPr>
-            <w:tcW w:type="dxa" w:w="3200"/>
-            <w:tcBorders>
-              <w:top w:val="single" w:color="BFBFBF" w:sz="4"/>
-              <w:left w:val="single" w:color="BFBFBF" w:sz="4"/>
-              <w:bottom w:val="single" w:color="BFBFBF" w:sz="4"/>
-              <w:right w:val="single" w:color="BFBFBF" w:sz="4"/>
-            </w:tcBorders>
-            <w:tcMar>
-              <w:top w:type="dxa" w:w="70"/>
-              <w:left w:type="dxa" w:w="110"/>
-              <w:bottom w:type="dxa" w:w="70"/>
-              <w:right w:type="dxa" w:w="110"/>
-            </w:tcMar>
-          </w:tcPr>
-          <w:p>
-            <w:pPr>
-              <w:jc w:val="center"/>
-            </w:pPr>
-            <w:r>
-              <w:rPr>
-                <w:rFonts w:ascii="Calibri" w:cs="Calibri" w:eastAsia="Calibri" w:hAnsi="Calibri"/>
-                <w:b w:val="false"/>
-                <w:bCs w:val="false"/>
-                <w:sz w:val="20"/>
-                <w:szCs w:val="20"/>
-              </w:rPr>
-              <w:t xml:space="preserve">1</w:t>
-            </w:r>
-          </w:p>
-        </w:tc>
-        <w:tc>
-          <w:tcPr>
-            <w:tcW w:type="dxa" w:w="3200"/>
-            <w:tcBorders>
-              <w:top w:val="single" w:color="BFBFBF" w:sz="4"/>
-              <w:left w:val="single" w:color="BFBFBF" w:sz="4"/>
-              <w:bottom w:val="single" w:color="BFBFBF" w:sz="4"/>
-              <w:right w:val="single" w:color="BFBFBF" w:sz="4"/>
-            </w:tcBorders>
-            <w:tcMar>
-              <w:top w:type="dxa" w:w="70"/>
-              <w:left w:type="dxa" w:w="110"/>
-              <w:bottom w:type="dxa" w:w="70"/>
-              <w:right w:type="dxa" w:w="110"/>
-            </w:tcMar>
-          </w:tcPr>
-          <w:p>
-            <w:pPr>
-              <w:jc w:val="center"/>
-            </w:pPr>
-            <w:r>
-              <w:rPr>
-                <w:rFonts w:ascii="Calibri" w:cs="Calibri" w:eastAsia="Calibri" w:hAnsi="Calibri"/>
-                <w:b w:val="false"/>
-                <w:bCs w:val="false"/>
-                <w:sz w:val="20"/>
-                <w:szCs w:val="20"/>
-              </w:rPr>
-              <w:t xml:space="preserve">2,840</w:t>
-            </w:r>
-          </w:p>
-        </w:tc>
-        <w:tc>
-          <w:tcPr>
-            <w:tcW w:type="dxa" w:w="3238"/>
-            <w:tcBorders>
-              <w:top w:val="single" w:color="BFBFBF" w:sz="4"/>
-              <w:left w:val="single" w:color="BFBFBF" w:sz="4"/>
-              <w:bottom w:val="single" w:color="BFBFBF" w:sz="4"/>
-              <w:right w:val="single" w:color="BFBFBF" w:sz="4"/>
-            </w:tcBorders>
-            <w:tcMar>
-              <w:top w:type="dxa" w:w="70"/>
-              <w:left w:type="dxa" w:w="110"/>
-              <w:bottom w:type="dxa" w:w="70"/>
-              <w:right w:type="dxa" w:w="110"/>
-            </w:tcMar>
-          </w:tcPr>
-          <w:p>
-            <w:pPr>
-              <w:jc w:val="center"/>
-            </w:pPr>
-            <w:r>
-              <w:rPr>
-                <w:rFonts w:ascii="Calibri" w:cs="Calibri" w:eastAsia="Calibri" w:hAnsi="Calibri"/>
-                <w:b w:val="false"/>
-                <w:bCs w:val="false"/>
-                <w:sz w:val="20"/>
-                <w:szCs w:val="20"/>
-              </w:rPr>
-              <w:t xml:space="preserve">identique à la référence</w:t>
-            </w:r>
-          </w:p>
-        </w:tc>
-      </w:tr>
-      <w:tr>
-        <w:tc>
-          <w:tcPr>
-            <w:tcW w:type="dxa" w:w="3200"/>
-            <w:tcBorders>
-              <w:top w:val="single" w:color="BFBFBF" w:sz="4"/>
-              <w:left w:val="single" w:color="BFBFBF" w:sz="4"/>
-              <w:bottom w:val="single" w:color="BFBFBF" w:sz="4"/>
-              <w:right w:val="single" w:color="BFBFBF" w:sz="4"/>
-            </w:tcBorders>
-            <w:shd w:fill="F2F2F2" w:color="auto" w:val="clear"/>
-            <w:tcMar>
-              <w:top w:type="dxa" w:w="70"/>
-              <w:left w:type="dxa" w:w="110"/>
-              <w:bottom w:type="dxa" w:w="70"/>
-              <w:right w:type="dxa" w:w="110"/>
-            </w:tcMar>
-          </w:tcPr>
-          <w:p>
-            <w:pPr>
-              <w:jc w:val="center"/>
-            </w:pPr>
-            <w:r>
-              <w:rPr>
-                <w:rFonts w:ascii="Calibri" w:cs="Calibri" w:eastAsia="Calibri" w:hAnsi="Calibri"/>
-                <w:b w:val="false"/>
-                <w:bCs w:val="false"/>
-                <w:sz w:val="20"/>
-                <w:szCs w:val="20"/>
-              </w:rPr>
-              <w:t xml:space="preserve">2</w:t>
-            </w:r>
-          </w:p>
-        </w:tc>
-        <w:tc>
-          <w:tcPr>
-            <w:tcW w:type="dxa" w:w="3200"/>
-            <w:tcBorders>
-              <w:top w:val="single" w:color="BFBFBF" w:sz="4"/>
-              <w:left w:val="single" w:color="BFBFBF" w:sz="4"/>
-              <w:bottom w:val="single" w:color="BFBFBF" w:sz="4"/>
-              <w:right w:val="single" w:color="BFBFBF" w:sz="4"/>
-            </w:tcBorders>
-            <w:shd w:fill="F2F2F2" w:color="auto" w:val="clear"/>
-            <w:tcMar>
-              <w:top w:type="dxa" w:w="70"/>
-              <w:left w:type="dxa" w:w="110"/>
-              <w:bottom w:type="dxa" w:w="70"/>
-              <w:right w:type="dxa" w:w="110"/>
-            </w:tcMar>
-          </w:tcPr>
-          <w:p>
-            <w:pPr>
-              <w:jc w:val="center"/>
-            </w:pPr>
-            <w:r>
-              <w:rPr>
-                <w:rFonts w:ascii="Calibri" w:cs="Calibri" w:eastAsia="Calibri" w:hAnsi="Calibri"/>
-                <w:b w:val="false"/>
-                <w:bCs w:val="false"/>
-                <w:sz w:val="20"/>
-                <w:szCs w:val="20"/>
-              </w:rPr>
-              <w:t xml:space="preserve">2,725</w:t>
-            </w:r>
-          </w:p>
-        </w:tc>
-        <w:tc>
-          <w:tcPr>
-            <w:tcW w:type="dxa" w:w="3238"/>
-            <w:tcBorders>
-              <w:top w:val="single" w:color="BFBFBF" w:sz="4"/>
-              <w:left w:val="single" w:color="BFBFBF" w:sz="4"/>
-              <w:bottom w:val="single" w:color="BFBFBF" w:sz="4"/>
-              <w:right w:val="single" w:color="BFBFBF" w:sz="4"/>
-            </w:tcBorders>
-            <w:shd w:fill="F2F2F2" w:color="auto" w:val="clear"/>
-            <w:tcMar>
-              <w:top w:type="dxa" w:w="70"/>
-              <w:left w:type="dxa" w:w="110"/>
-              <w:bottom w:type="dxa" w:w="70"/>
-              <w:right w:type="dxa" w:w="110"/>
-            </w:tcMar>
-          </w:tcPr>
-          <w:p>
-            <w:pPr>
-              <w:jc w:val="center"/>
-            </w:pPr>
-            <w:r>
-              <w:rPr>
-                <w:rFonts w:ascii="Calibri" w:cs="Calibri" w:eastAsia="Calibri" w:hAnsi="Calibri"/>
-                <w:b w:val="false"/>
-                <w:bCs w:val="false"/>
-                <w:sz w:val="20"/>
-                <w:szCs w:val="20"/>
-              </w:rPr>
-              <w:t xml:space="preserve">identique à la référence</w:t>
-            </w:r>
-          </w:p>
-        </w:tc>
-      </w:tr>
-      <w:tr>
-        <w:tc>
-          <w:tcPr>
-            <w:tcW w:type="dxa" w:w="3200"/>
-            <w:tcBorders>
-              <w:top w:val="single" w:color="BFBFBF" w:sz="4"/>
-              <w:left w:val="single" w:color="BFBFBF" w:sz="4"/>
-              <w:bottom w:val="single" w:color="BFBFBF" w:sz="4"/>
-              <w:right w:val="single" w:color="BFBFBF" w:sz="4"/>
-            </w:tcBorders>
-            <w:tcMar>
-              <w:top w:type="dxa" w:w="70"/>
-              <w:left w:type="dxa" w:w="110"/>
-              <w:bottom w:type="dxa" w:w="70"/>
-              <w:right w:type="dxa" w:w="110"/>
-            </w:tcMar>
-          </w:tcPr>
-          <w:p>
-            <w:pPr>
-              <w:jc w:val="center"/>
-            </w:pPr>
-            <w:r>
-              <w:rPr>
-                <w:rFonts w:ascii="Calibri" w:cs="Calibri" w:eastAsia="Calibri" w:hAnsi="Calibri"/>
-                <w:b w:val="false"/>
-                <w:bCs w:val="false"/>
-                <w:sz w:val="20"/>
-                <w:szCs w:val="20"/>
-              </w:rPr>
-              <w:t xml:space="preserve">3</w:t>
-            </w:r>
-          </w:p>
-        </w:tc>
-        <w:tc>
-          <w:tcPr>
-            <w:tcW w:type="dxa" w:w="3200"/>
-            <w:tcBorders>
-              <w:top w:val="single" w:color="BFBFBF" w:sz="4"/>
-              <w:left w:val="single" w:color="BFBFBF" w:sz="4"/>
-              <w:bottom w:val="single" w:color="BFBFBF" w:sz="4"/>
-              <w:right w:val="single" w:color="BFBFBF" w:sz="4"/>
-            </w:tcBorders>
-            <w:tcMar>
-              <w:top w:type="dxa" w:w="70"/>
-              <w:left w:type="dxa" w:w="110"/>
-              <w:bottom w:type="dxa" w:w="70"/>
-              <w:right w:type="dxa" w:w="110"/>
-            </w:tcMar>
-          </w:tcPr>
-          <w:p>
-            <w:pPr>
-              <w:jc w:val="center"/>
-            </w:pPr>
-            <w:r>
-              <w:rPr>
-                <w:rFonts w:ascii="Calibri" w:cs="Calibri" w:eastAsia="Calibri" w:hAnsi="Calibri"/>
-                <w:b w:val="false"/>
-                <w:bCs w:val="false"/>
-                <w:sz w:val="20"/>
-                <w:szCs w:val="20"/>
-              </w:rPr>
-              <w:t xml:space="preserve">2,839</w:t>
-            </w:r>
-          </w:p>
-        </w:tc>
-        <w:tc>
-          <w:tcPr>
-            <w:tcW w:type="dxa" w:w="3238"/>
-            <w:tcBorders>
-              <w:top w:val="single" w:color="BFBFBF" w:sz="4"/>
-              <w:left w:val="single" w:color="BFBFBF" w:sz="4"/>
-              <w:bottom w:val="single" w:color="BFBFBF" w:sz="4"/>
-              <w:right w:val="single" w:color="BFBFBF" w:sz="4"/>
-            </w:tcBorders>
-            <w:tcMar>
-              <w:top w:type="dxa" w:w="70"/>
-              <w:left w:type="dxa" w:w="110"/>
-              <w:bottom w:type="dxa" w:w="70"/>
-              <w:right w:type="dxa" w:w="110"/>
-            </w:tcMar>
-          </w:tcPr>
-          <w:p>
-            <w:pPr>
-              <w:jc w:val="center"/>
-            </w:pPr>
-            <w:r>
-              <w:rPr>
-                <w:rFonts w:ascii="Calibri" w:cs="Calibri" w:eastAsia="Calibri" w:hAnsi="Calibri"/>
-                <w:b w:val="false"/>
-                <w:bCs w:val="false"/>
-                <w:sz w:val="20"/>
-                <w:szCs w:val="20"/>
-              </w:rPr>
-              <w:t xml:space="preserve">identique à la référence</w:t>
-            </w:r>
-          </w:p>
-        </w:tc>
-      </w:tr>
-      <w:tr>
-        <w:tc>
-          <w:tcPr>
-            <w:tcW w:type="dxa" w:w="3200"/>
-            <w:tcBorders>
-              <w:top w:val="single" w:color="BFBFBF" w:sz="4"/>
-              <w:left w:val="single" w:color="BFBFBF" w:sz="4"/>
-              <w:bottom w:val="single" w:color="BFBFBF" w:sz="4"/>
-              <w:right w:val="single" w:color="BFBFBF" w:sz="4"/>
-            </w:tcBorders>
-            <w:shd w:fill="F2F2F2" w:color="auto" w:val="clear"/>
-            <w:tcMar>
-              <w:top w:type="dxa" w:w="70"/>
-              <w:left w:type="dxa" w:w="110"/>
-              <w:bottom w:type="dxa" w:w="70"/>
-              <w:right w:type="dxa" w:w="110"/>
-            </w:tcMar>
-          </w:tcPr>
-          <w:p>
-            <w:pPr>
-              <w:jc w:val="center"/>
-            </w:pPr>
-            <w:r>
-              <w:rPr>
-                <w:rFonts w:ascii="Calibri" w:cs="Calibri" w:eastAsia="Calibri" w:hAnsi="Calibri"/>
-                <w:b/>
-                <w:bCs/>
-              </w:rPr>
-              <w:t xml:space="preserve">T₁ (médiane)</w:t>
-            </w:r>
-          </w:p>
-        </w:tc>
-        <w:tc>
-          <w:tcPr>
-            <w:tcW w:type="dxa" w:w="3200"/>
-            <w:tcBorders>
-              <w:top w:val="single" w:color="BFBFBF" w:sz="4"/>
-              <w:left w:val="single" w:color="BFBFBF" w:sz="4"/>
-              <w:bottom w:val="single" w:color="BFBFBF" w:sz="4"/>
-              <w:right w:val="single" w:color="BFBFBF" w:sz="4"/>
-            </w:tcBorders>
-            <w:shd w:fill="F2F2F2" w:color="auto" w:val="clear"/>
-            <w:tcMar>
-              <w:top w:type="dxa" w:w="70"/>
-              <w:left w:type="dxa" w:w="110"/>
-              <w:bottom w:type="dxa" w:w="70"/>
-              <w:right w:type="dxa" w:w="110"/>
-            </w:tcMar>
-          </w:tcPr>
-          <w:p>
-            <w:pPr>
-              <w:jc w:val="center"/>
-            </w:pPr>
-            <w:r>
-              <w:rPr>
-                <w:rFonts w:ascii="Calibri" w:cs="Calibri" w:eastAsia="Calibri" w:hAnsi="Calibri"/>
-                <w:b/>
-                <w:bCs/>
-              </w:rPr>
-              <w:t xml:space="preserve">2,84</w:t>
-            </w:r>
-          </w:p>
-        </w:tc>
-        <w:tc>
-          <w:tcPr>
-            <w:tcW w:type="dxa" w:w="3238"/>
-            <w:tcBorders>
-              <w:top w:val="single" w:color="BFBFBF" w:sz="4"/>
-              <w:left w:val="single" w:color="BFBFBF" w:sz="4"/>
-              <w:bottom w:val="single" w:color="BFBFBF" w:sz="4"/>
-              <w:right w:val="single" w:color="BFBFBF" w:sz="4"/>
-            </w:tcBorders>
-            <w:shd w:fill="F2F2F2" w:color="auto" w:val="clear"/>
-            <w:tcMar>
-              <w:top w:type="dxa" w:w="70"/>
-              <w:left w:type="dxa" w:w="110"/>
-              <w:bottom w:type="dxa" w:w="70"/>
-              <w:right w:type="dxa" w:w="110"/>
-            </w:tcMar>
-          </w:tcPr>
-          <w:p>
-            <w:pPr>
-              <w:jc w:val="center"/>
-            </w:pPr>
-            <w:r>
-              <w:rPr>
-                <w:rFonts w:ascii="Calibri" w:cs="Calibri" w:eastAsia="Calibri" w:hAnsi="Calibri"/>
-                <w:b w:val="false"/>
-                <w:bCs w:val="false"/>
-                <w:sz w:val="20"/>
-                <w:szCs w:val="20"/>
-              </w:rPr>
-              <w:t xml:space="preserve">écart max ≈ 4 %</w:t>
-            </w:r>
-          </w:p>
-        </w:tc>
-      </w:tr>
-    </w:tbl>
-    <w:p>
-      <w:pPr>
-        <w:spacing w:after="60"/>
-      </w:pPr>
-    </w:p>
-    <w:p>
-      <w:pPr>
-        <w:spacing w:after="120" w:line="276"/>
-      </w:pPr>
-      <w:r>
-        <w:rPr>
-          <w:rFonts w:ascii="Calibri" w:cs="Calibri" w:eastAsia="Calibri" w:hAnsi="Calibri"/>
-        </w:rPr>
-        <w:t xml:space="preserve">Les trois mesures sont très proches (écart d'environ 4 %), et le résumé global est identique à chaque exécution : le programme est déterministe et la mesure est fiable. T₁ = 2,84 s sert de référence pour les speedups mesurés sur cette machine.</w:t>
-      </w:r>
-    </w:p>
-    <w:p>
-      <w:pPr>
-        <w:pStyle w:val="Heading2"/>
-      </w:pPr>
-      <w:r>
-        <w:rPr>
-          <w:rFonts w:ascii="Calibri" w:cs="Calibri" w:eastAsia="Calibri" w:hAnsi="Calibri"/>
-        </w:rPr>
-        <w:t xml:space="preserve">2.2 Profilage avec cProfile</w:t>
-      </w:r>
-    </w:p>
-    <w:p>
-      <w:pPr>
-        <w:shd w:fill="F2F2F2" w:color="auto" w:val="clear"/>
-        <w:spacing w:after="0"/>
-        <w:ind w:left="200"/>
-      </w:pPr>
-      <w:r>
-        <w:rPr>
-          <w:rFonts w:ascii="Consolas" w:cs="Consolas" w:eastAsia="Consolas" w:hAnsi="Consolas"/>
-          <w:sz w:val="19"/>
-          <w:szCs w:val="19"/>
-        </w:rPr>
-        <w:t xml:space="preserve">python -m cProfile -s cumulative sequential_pipeline.py</w:t>
-      </w:r>
-    </w:p>
-    <w:p>
-      <w:pPr>
-        <w:spacing w:after="60"/>
-      </w:pPr>
-    </w:p>
-    <w:tbl>
-      <w:tblPr>
-        <w:tblW w:type="dxa" w:w="9638"/>
-        <w:tblBorders>
-          <w:top w:val="single" w:color="auto" w:sz="4"/>
-          <w:left w:val="single" w:color="auto" w:sz="4"/>
-          <w:bottom w:val="single" w:color="auto" w:sz="4"/>
-          <w:right w:val="single" w:color="auto" w:sz="4"/>
-          <w:insideH w:val="single" w:color="auto" w:sz="4"/>
-          <w:insideV w:val="single" w:color="auto" w:sz="4"/>
-        </w:tblBorders>
-      </w:tblPr>
-      <w:tblGrid>
-        <w:gridCol w:w="3700"/>
-        <w:gridCol w:w="1300"/>
-        <w:gridCol w:w="2300"/>
-        <w:gridCol w:w="2338"/>
-      </w:tblGrid>
-      <w:tr>
-        <w:trPr>
-          <w:tblHeader/>
-        </w:trPr>
-        <w:tc>
-          <w:tcPr>
-            <w:tcW w:type="dxa" w:w="3700"/>
+              <w:t xml:space="preserve">Séquentiel, 24 images (s)</w:t>
+            </w:r>
+          </w:p>
+        </w:tc>
+        <w:tc>
+          <w:tcPr>
+            <w:tcW w:type="dxa" w:w="2438"/>
             <w:tcBorders>
               <w:top w:val="single" w:color="BFBFBF" w:sz="4"/>
               <w:left w:val="single" w:color="BFBFBF" w:sz="4"/>
@@ -3627,7 +3185,7 @@
           </w:tcPr>
           <w:p>
             <w:pPr>
-              <w:jc w:val="left"/>
+              <w:jc w:val="center"/>
             </w:pPr>
             <w:r>
               <w:rPr>
@@ -3638,54 +3196,55 @@
                 <w:sz w:val="20"/>
                 <w:szCs w:val="20"/>
               </w:rPr>
-              <w:t xml:space="preserve">Fonction</w:t>
-            </w:r>
-          </w:p>
-        </w:tc>
-        <w:tc>
-          <w:tcPr>
-            <w:tcW w:type="dxa" w:w="1300"/>
-            <w:tcBorders>
-              <w:top w:val="single" w:color="BFBFBF" w:sz="4"/>
-              <w:left w:val="single" w:color="BFBFBF" w:sz="4"/>
-              <w:bottom w:val="single" w:color="BFBFBF" w:sz="4"/>
-              <w:right w:val="single" w:color="BFBFBF" w:sz="4"/>
-            </w:tcBorders>
-            <w:shd w:fill="1F3864" w:color="auto" w:val="clear"/>
-            <w:tcMar>
-              <w:top w:type="dxa" w:w="70"/>
-              <w:left w:type="dxa" w:w="110"/>
-              <w:bottom w:type="dxa" w:w="70"/>
-              <w:right w:type="dxa" w:w="110"/>
-            </w:tcMar>
-          </w:tcPr>
-          <w:p>
-            <w:pPr>
-              <w:jc w:val="center"/>
+              <w:t xml:space="preserve">Vectorisé, 24 images (s)</w:t>
+            </w:r>
+          </w:p>
+        </w:tc>
+      </w:tr>
+      <w:tr>
+        <w:tc>
+          <w:tcPr>
+            <w:tcW w:type="dxa" w:w="3300"/>
+            <w:tcBorders>
+              <w:top w:val="single" w:color="BFBFBF" w:sz="4"/>
+              <w:left w:val="single" w:color="BFBFBF" w:sz="4"/>
+              <w:bottom w:val="single" w:color="BFBFBF" w:sz="4"/>
+              <w:right w:val="single" w:color="BFBFBF" w:sz="4"/>
+            </w:tcBorders>
+            <w:shd w:fill="FCE4D6" w:color="auto" w:val="clear"/>
+            <w:tcMar>
+              <w:top w:type="dxa" w:w="70"/>
+              <w:left w:type="dxa" w:w="110"/>
+              <w:bottom w:type="dxa" w:w="70"/>
+              <w:right w:type="dxa" w:w="110"/>
+            </w:tcMar>
+          </w:tcPr>
+          <w:p>
+            <w:pPr>
+              <w:jc w:val="left"/>
             </w:pPr>
             <w:r>
               <w:rPr>
                 <w:rFonts w:ascii="Calibri" w:cs="Calibri" w:eastAsia="Calibri" w:hAnsi="Calibri"/>
                 <w:b/>
                 <w:bCs/>
-                <w:color w:val="FFFFFF"/>
-                <w:sz w:val="20"/>
-                <w:szCs w:val="20"/>
-              </w:rPr>
-              <w:t xml:space="preserve">Appels</w:t>
-            </w:r>
-          </w:p>
-        </w:tc>
-        <w:tc>
-          <w:tcPr>
-            <w:tcW w:type="dxa" w:w="2300"/>
-            <w:tcBorders>
-              <w:top w:val="single" w:color="BFBFBF" w:sz="4"/>
-              <w:left w:val="single" w:color="BFBFBF" w:sz="4"/>
-              <w:bottom w:val="single" w:color="BFBFBF" w:sz="4"/>
-              <w:right w:val="single" w:color="BFBFBF" w:sz="4"/>
-            </w:tcBorders>
-            <w:shd w:fill="1F3864" w:color="auto" w:val="clear"/>
+                <w:sz w:val="20"/>
+                <w:szCs w:val="20"/>
+              </w:rPr>
+              <w:t xml:space="preserve">mean_filter_3x3</w:t>
+            </w:r>
+          </w:p>
+        </w:tc>
+        <w:tc>
+          <w:tcPr>
+            <w:tcW w:type="dxa" w:w="1500"/>
+            <w:tcBorders>
+              <w:top w:val="single" w:color="BFBFBF" w:sz="4"/>
+              <w:left w:val="single" w:color="BFBFBF" w:sz="4"/>
+              <w:bottom w:val="single" w:color="BFBFBF" w:sz="4"/>
+              <w:right w:val="single" w:color="BFBFBF" w:sz="4"/>
+            </w:tcBorders>
+            <w:shd w:fill="FCE4D6" w:color="auto" w:val="clear"/>
             <w:tcMar>
               <w:top w:type="dxa" w:w="70"/>
               <w:left w:type="dxa" w:w="110"/>
@@ -3702,24 +3261,56 @@
                 <w:rFonts w:ascii="Calibri" w:cs="Calibri" w:eastAsia="Calibri" w:hAnsi="Calibri"/>
                 <w:b/>
                 <w:bCs/>
-                <w:color w:val="FFFFFF"/>
-                <w:sz w:val="20"/>
-                <w:szCs w:val="20"/>
-              </w:rPr>
-              <w:t xml:space="preserve">Temps cumulé (s)</w:t>
-            </w:r>
-          </w:p>
-        </w:tc>
-        <w:tc>
-          <w:tcPr>
-            <w:tcW w:type="dxa" w:w="2338"/>
-            <w:tcBorders>
-              <w:top w:val="single" w:color="BFBFBF" w:sz="4"/>
-              <w:left w:val="single" w:color="BFBFBF" w:sz="4"/>
-              <w:bottom w:val="single" w:color="BFBFBF" w:sz="4"/>
-              <w:right w:val="single" w:color="BFBFBF" w:sz="4"/>
-            </w:tcBorders>
-            <w:shd w:fill="1F3864" w:color="auto" w:val="clear"/>
+                <w:sz w:val="20"/>
+                <w:szCs w:val="20"/>
+              </w:rPr>
+              <w:t xml:space="preserve">≈ 77 %</w:t>
+            </w:r>
+          </w:p>
+        </w:tc>
+        <w:tc>
+          <w:tcPr>
+            <w:tcW w:type="dxa" w:w="2400"/>
+            <w:tcBorders>
+              <w:top w:val="single" w:color="BFBFBF" w:sz="4"/>
+              <w:left w:val="single" w:color="BFBFBF" w:sz="4"/>
+              <w:bottom w:val="single" w:color="BFBFBF" w:sz="4"/>
+              <w:right w:val="single" w:color="BFBFBF" w:sz="4"/>
+            </w:tcBorders>
+            <w:shd w:fill="FCE4D6" w:color="auto" w:val="clear"/>
+            <w:tcMar>
+              <w:top w:type="dxa" w:w="70"/>
+              <w:left w:type="dxa" w:w="110"/>
+              <w:bottom w:type="dxa" w:w="70"/>
+              <w:right w:type="dxa" w:w="110"/>
+            </w:tcMar>
+          </w:tcPr>
+          <w:p>
+            <w:pPr>
+              <w:jc w:val="center"/>
+            </w:pPr>
+            <w:r>
+              <w:rPr>
+                <w:rFonts w:ascii="Calibri" w:cs="Calibri" w:eastAsia="Calibri" w:hAnsi="Calibri"/>
+                <w:b w:val="false"/>
+                <w:bCs w:val="false"/>
+                <w:sz w:val="20"/>
+                <w:szCs w:val="20"/>
+              </w:rPr>
+              <w:t xml:space="preserve">2,499</w:t>
+            </w:r>
+          </w:p>
+        </w:tc>
+        <w:tc>
+          <w:tcPr>
+            <w:tcW w:type="dxa" w:w="2438"/>
+            <w:tcBorders>
+              <w:top w:val="single" w:color="BFBFBF" w:sz="4"/>
+              <w:left w:val="single" w:color="BFBFBF" w:sz="4"/>
+              <w:bottom w:val="single" w:color="BFBFBF" w:sz="4"/>
+              <w:right w:val="single" w:color="BFBFBF" w:sz="4"/>
+            </w:tcBorders>
+            <w:shd w:fill="FCE4D6" w:color="auto" w:val="clear"/>
             <w:tcMar>
               <w:top w:type="dxa" w:w="70"/>
               <w:left w:type="dxa" w:w="110"/>
@@ -3736,11 +3327,10 @@
                 <w:rFonts w:ascii="Calibri" w:cs="Calibri" w:eastAsia="Calibri" w:hAnsi="Calibri"/>
                 <w:b/>
                 <w:bCs/>
-                <w:color w:val="FFFFFF"/>
-                <w:sz w:val="20"/>
-                <w:szCs w:val="20"/>
-              </w:rPr>
-              <w:t xml:space="preserve">Part du total</w:t>
+                <w:sz w:val="20"/>
+                <w:szCs w:val="20"/>
+              </w:rPr>
+              <w:t xml:space="preserve">0,0146  (× 172)</w:t>
             </w:r>
           </w:p>
         </w:tc>
@@ -3748,14 +3338,14 @@
       <w:tr>
         <w:tc>
           <w:tcPr>
-            <w:tcW w:type="dxa" w:w="3700"/>
-            <w:tcBorders>
-              <w:top w:val="single" w:color="BFBFBF" w:sz="4"/>
-              <w:left w:val="single" w:color="BFBFBF" w:sz="4"/>
-              <w:bottom w:val="single" w:color="BFBFBF" w:sz="4"/>
-              <w:right w:val="single" w:color="BFBFBF" w:sz="4"/>
-            </w:tcBorders>
-            <w:shd w:fill="FCE4D6" w:color="auto" w:val="clear"/>
+            <w:tcW w:type="dxa" w:w="3300"/>
+            <w:tcBorders>
+              <w:top w:val="single" w:color="BFBFBF" w:sz="4"/>
+              <w:left w:val="single" w:color="BFBFBF" w:sz="4"/>
+              <w:bottom w:val="single" w:color="BFBFBF" w:sz="4"/>
+              <w:right w:val="single" w:color="BFBFBF" w:sz="4"/>
+            </w:tcBorders>
+            <w:shd w:fill="F2F2F2" w:color="auto" w:val="clear"/>
             <w:tcMar>
               <w:top w:type="dxa" w:w="70"/>
               <w:left w:type="dxa" w:w="110"/>
@@ -3770,111 +3360,111 @@
             <w:r>
               <w:rPr>
                 <w:rFonts w:ascii="Calibri" w:cs="Calibri" w:eastAsia="Calibri" w:hAnsi="Calibri"/>
-                <w:b/>
-                <w:bCs/>
-                <w:sz w:val="20"/>
-                <w:szCs w:val="20"/>
-              </w:rPr>
-              <w:t xml:space="preserve">mean_filter_3x3</w:t>
-            </w:r>
-          </w:p>
-        </w:tc>
-        <w:tc>
-          <w:tcPr>
-            <w:tcW w:type="dxa" w:w="1300"/>
-            <w:tcBorders>
-              <w:top w:val="single" w:color="BFBFBF" w:sz="4"/>
-              <w:left w:val="single" w:color="BFBFBF" w:sz="4"/>
-              <w:bottom w:val="single" w:color="BFBFBF" w:sz="4"/>
-              <w:right w:val="single" w:color="BFBFBF" w:sz="4"/>
-            </w:tcBorders>
-            <w:shd w:fill="FCE4D6" w:color="auto" w:val="clear"/>
-            <w:tcMar>
-              <w:top w:type="dxa" w:w="70"/>
-              <w:left w:type="dxa" w:w="110"/>
-              <w:bottom w:type="dxa" w:w="70"/>
-              <w:right w:type="dxa" w:w="110"/>
-            </w:tcMar>
-          </w:tcPr>
-          <w:p>
-            <w:pPr>
-              <w:jc w:val="center"/>
-            </w:pPr>
-            <w:r>
-              <w:rPr>
-                <w:rFonts w:ascii="Calibri" w:cs="Calibri" w:eastAsia="Calibri" w:hAnsi="Calibri"/>
-                <w:b w:val="false"/>
-                <w:bCs w:val="false"/>
-                <w:sz w:val="20"/>
-                <w:szCs w:val="20"/>
-              </w:rPr>
-              <w:t xml:space="preserve">24</w:t>
-            </w:r>
-          </w:p>
-        </w:tc>
-        <w:tc>
-          <w:tcPr>
-            <w:tcW w:type="dxa" w:w="2300"/>
-            <w:tcBorders>
-              <w:top w:val="single" w:color="BFBFBF" w:sz="4"/>
-              <w:left w:val="single" w:color="BFBFBF" w:sz="4"/>
-              <w:bottom w:val="single" w:color="BFBFBF" w:sz="4"/>
-              <w:right w:val="single" w:color="BFBFBF" w:sz="4"/>
-            </w:tcBorders>
-            <w:shd w:fill="FCE4D6" w:color="auto" w:val="clear"/>
-            <w:tcMar>
-              <w:top w:type="dxa" w:w="70"/>
-              <w:left w:type="dxa" w:w="110"/>
-              <w:bottom w:type="dxa" w:w="70"/>
-              <w:right w:type="dxa" w:w="110"/>
-            </w:tcMar>
-          </w:tcPr>
-          <w:p>
-            <w:pPr>
-              <w:jc w:val="center"/>
-            </w:pPr>
-            <w:r>
-              <w:rPr>
-                <w:rFonts w:ascii="Calibri" w:cs="Calibri" w:eastAsia="Calibri" w:hAnsi="Calibri"/>
-                <w:b/>
-                <w:bCs/>
-                <w:sz w:val="20"/>
-                <w:szCs w:val="20"/>
-              </w:rPr>
-              <w:t xml:space="preserve">3,93</w:t>
-            </w:r>
-          </w:p>
-        </w:tc>
-        <w:tc>
-          <w:tcPr>
-            <w:tcW w:type="dxa" w:w="2338"/>
-            <w:tcBorders>
-              <w:top w:val="single" w:color="BFBFBF" w:sz="4"/>
-              <w:left w:val="single" w:color="BFBFBF" w:sz="4"/>
-              <w:bottom w:val="single" w:color="BFBFBF" w:sz="4"/>
-              <w:right w:val="single" w:color="BFBFBF" w:sz="4"/>
-            </w:tcBorders>
-            <w:shd w:fill="FCE4D6" w:color="auto" w:val="clear"/>
-            <w:tcMar>
-              <w:top w:type="dxa" w:w="70"/>
-              <w:left w:type="dxa" w:w="110"/>
-              <w:bottom w:type="dxa" w:w="70"/>
-              <w:right w:type="dxa" w:w="110"/>
-            </w:tcMar>
-          </w:tcPr>
-          <w:p>
-            <w:pPr>
-              <w:jc w:val="center"/>
-            </w:pPr>
-            <w:r>
-              <w:rPr>
-                <w:rFonts w:ascii="Calibri" w:cs="Calibri" w:eastAsia="Calibri" w:hAnsi="Calibri"/>
-                <w:b/>
-                <w:bCs/>
-                <w:sz w:val="20"/>
-                <w:szCs w:val="20"/>
-              </w:rPr>
-              <w:t xml:space="preserve">≈ 77 %</w:t>
+                <w:b w:val="false"/>
+                <w:bCs w:val="false"/>
+                <w:sz w:val="20"/>
+                <w:szCs w:val="20"/>
+              </w:rPr>
+              <w:t xml:space="preserve">normalize_image</w:t>
+            </w:r>
+          </w:p>
+        </w:tc>
+        <w:tc>
+          <w:tcPr>
+            <w:tcW w:type="dxa" w:w="1500"/>
+            <w:tcBorders>
+              <w:top w:val="single" w:color="BFBFBF" w:sz="4"/>
+              <w:left w:val="single" w:color="BFBFBF" w:sz="4"/>
+              <w:bottom w:val="single" w:color="BFBFBF" w:sz="4"/>
+              <w:right w:val="single" w:color="BFBFBF" w:sz="4"/>
+            </w:tcBorders>
+            <w:shd w:fill="F2F2F2" w:color="auto" w:val="clear"/>
+            <w:tcMar>
+              <w:top w:type="dxa" w:w="70"/>
+              <w:left w:type="dxa" w:w="110"/>
+              <w:bottom w:type="dxa" w:w="70"/>
+              <w:right w:type="dxa" w:w="110"/>
+            </w:tcMar>
+          </w:tcPr>
+          <w:p>
+            <w:pPr>
+              <w:jc w:val="center"/>
+            </w:pPr>
+            <w:r>
+              <w:rPr>
+                <w:rFonts w:ascii="Calibri" w:cs="Calibri" w:eastAsia="Calibri" w:hAnsi="Calibri"/>
+                <w:b w:val="false"/>
+                <w:bCs w:val="false"/>
+                <w:sz w:val="20"/>
+                <w:szCs w:val="20"/>
+              </w:rPr>
+              <w:t xml:space="preserve">≈ 12 %</w:t>
+            </w:r>
+          </w:p>
+        </w:tc>
+        <w:tc>
+          <w:tcPr>
+            <w:tcW w:type="dxa" w:w="2400"/>
+            <w:tcBorders>
+              <w:top w:val="single" w:color="BFBFBF" w:sz="4"/>
+              <w:left w:val="single" w:color="BFBFBF" w:sz="4"/>
+              <w:bottom w:val="single" w:color="BFBFBF" w:sz="4"/>
+              <w:right w:val="single" w:color="BFBFBF" w:sz="4"/>
+            </w:tcBorders>
+            <w:shd w:fill="F2F2F2" w:color="auto" w:val="clear"/>
+            <w:tcMar>
+              <w:top w:type="dxa" w:w="70"/>
+              <w:left w:type="dxa" w:w="110"/>
+              <w:bottom w:type="dxa" w:w="70"/>
+              <w:right w:type="dxa" w:w="110"/>
+            </w:tcMar>
+          </w:tcPr>
+          <w:p>
+            <w:pPr>
+              <w:jc w:val="center"/>
+            </w:pPr>
+            <w:r>
+              <w:rPr>
+                <w:rFonts w:ascii="Calibri" w:cs="Calibri" w:eastAsia="Calibri" w:hAnsi="Calibri"/>
+                <w:b w:val="false"/>
+                <w:bCs w:val="false"/>
+                <w:sz w:val="20"/>
+                <w:szCs w:val="20"/>
+              </w:rPr>
+              <w:t xml:space="preserve">0,351</w:t>
+            </w:r>
+          </w:p>
+        </w:tc>
+        <w:tc>
+          <w:tcPr>
+            <w:tcW w:type="dxa" w:w="2438"/>
+            <w:tcBorders>
+              <w:top w:val="single" w:color="BFBFBF" w:sz="4"/>
+              <w:left w:val="single" w:color="BFBFBF" w:sz="4"/>
+              <w:bottom w:val="single" w:color="BFBFBF" w:sz="4"/>
+              <w:right w:val="single" w:color="BFBFBF" w:sz="4"/>
+            </w:tcBorders>
+            <w:shd w:fill="F2F2F2" w:color="auto" w:val="clear"/>
+            <w:tcMar>
+              <w:top w:type="dxa" w:w="70"/>
+              <w:left w:type="dxa" w:w="110"/>
+              <w:bottom w:type="dxa" w:w="70"/>
+              <w:right w:type="dxa" w:w="110"/>
+            </w:tcMar>
+          </w:tcPr>
+          <w:p>
+            <w:pPr>
+              <w:jc w:val="center"/>
+            </w:pPr>
+            <w:r>
+              <w:rPr>
+                <w:rFonts w:ascii="Calibri" w:cs="Calibri" w:eastAsia="Calibri" w:hAnsi="Calibri"/>
+                <w:b w:val="false"/>
+                <w:bCs w:val="false"/>
+                <w:sz w:val="20"/>
+                <w:szCs w:val="20"/>
+              </w:rPr>
+              <w:t xml:space="preserve">0,0027  (× 128)</w:t>
             </w:r>
           </w:p>
         </w:tc>
@@ -3882,14 +3472,13 @@
       <w:tr>
         <w:tc>
           <w:tcPr>
-            <w:tcW w:type="dxa" w:w="3700"/>
-            <w:tcBorders>
-              <w:top w:val="single" w:color="BFBFBF" w:sz="4"/>
-              <w:left w:val="single" w:color="BFBFBF" w:sz="4"/>
-              <w:bottom w:val="single" w:color="BFBFBF" w:sz="4"/>
-              <w:right w:val="single" w:color="BFBFBF" w:sz="4"/>
-            </w:tcBorders>
-            <w:shd w:fill="F2F2F2" w:color="auto" w:val="clear"/>
+            <w:tcW w:type="dxa" w:w="3300"/>
+            <w:tcBorders>
+              <w:top w:val="single" w:color="BFBFBF" w:sz="4"/>
+              <w:left w:val="single" w:color="BFBFBF" w:sz="4"/>
+              <w:bottom w:val="single" w:color="BFBFBF" w:sz="4"/>
+              <w:right w:val="single" w:color="BFBFBF" w:sz="4"/>
+            </w:tcBorders>
             <w:tcMar>
               <w:top w:type="dxa" w:w="70"/>
               <w:left w:type="dxa" w:w="110"/>
@@ -3909,106 +3498,103 @@
                 <w:sz w:val="20"/>
                 <w:szCs w:val="20"/>
               </w:rPr>
-              <w:t xml:space="preserve">normalize_image</w:t>
-            </w:r>
-          </w:p>
-        </w:tc>
-        <w:tc>
-          <w:tcPr>
-            <w:tcW w:type="dxa" w:w="1300"/>
-            <w:tcBorders>
-              <w:top w:val="single" w:color="BFBFBF" w:sz="4"/>
-              <w:left w:val="single" w:color="BFBFBF" w:sz="4"/>
-              <w:bottom w:val="single" w:color="BFBFBF" w:sz="4"/>
-              <w:right w:val="single" w:color="BFBFBF" w:sz="4"/>
-            </w:tcBorders>
-            <w:shd w:fill="F2F2F2" w:color="auto" w:val="clear"/>
-            <w:tcMar>
-              <w:top w:type="dxa" w:w="70"/>
-              <w:left w:type="dxa" w:w="110"/>
-              <w:bottom w:type="dxa" w:w="70"/>
-              <w:right w:type="dxa" w:w="110"/>
-            </w:tcMar>
-          </w:tcPr>
-          <w:p>
-            <w:pPr>
-              <w:jc w:val="center"/>
-            </w:pPr>
-            <w:r>
-              <w:rPr>
-                <w:rFonts w:ascii="Calibri" w:cs="Calibri" w:eastAsia="Calibri" w:hAnsi="Calibri"/>
-                <w:b w:val="false"/>
-                <w:bCs w:val="false"/>
-                <w:sz w:val="20"/>
-                <w:szCs w:val="20"/>
-              </w:rPr>
-              <w:t xml:space="preserve">24</w:t>
-            </w:r>
-          </w:p>
-        </w:tc>
-        <w:tc>
-          <w:tcPr>
-            <w:tcW w:type="dxa" w:w="2300"/>
-            <w:tcBorders>
-              <w:top w:val="single" w:color="BFBFBF" w:sz="4"/>
-              <w:left w:val="single" w:color="BFBFBF" w:sz="4"/>
-              <w:bottom w:val="single" w:color="BFBFBF" w:sz="4"/>
-              <w:right w:val="single" w:color="BFBFBF" w:sz="4"/>
-            </w:tcBorders>
-            <w:shd w:fill="F2F2F2" w:color="auto" w:val="clear"/>
-            <w:tcMar>
-              <w:top w:type="dxa" w:w="70"/>
-              <w:left w:type="dxa" w:w="110"/>
-              <w:bottom w:type="dxa" w:w="70"/>
-              <w:right w:type="dxa" w:w="110"/>
-            </w:tcMar>
-          </w:tcPr>
-          <w:p>
-            <w:pPr>
-              <w:jc w:val="center"/>
-            </w:pPr>
-            <w:r>
-              <w:rPr>
-                <w:rFonts w:ascii="Calibri" w:cs="Calibri" w:eastAsia="Calibri" w:hAnsi="Calibri"/>
-                <w:b w:val="false"/>
-                <w:bCs w:val="false"/>
-                <w:sz w:val="20"/>
-                <w:szCs w:val="20"/>
-              </w:rPr>
-              <w:t xml:space="preserve">0,64</w:t>
-            </w:r>
-          </w:p>
-        </w:tc>
-        <w:tc>
-          <w:tcPr>
-            <w:tcW w:type="dxa" w:w="2338"/>
-            <w:tcBorders>
-              <w:top w:val="single" w:color="BFBFBF" w:sz="4"/>
-              <w:left w:val="single" w:color="BFBFBF" w:sz="4"/>
-              <w:bottom w:val="single" w:color="BFBFBF" w:sz="4"/>
-              <w:right w:val="single" w:color="BFBFBF" w:sz="4"/>
-            </w:tcBorders>
-            <w:shd w:fill="F2F2F2" w:color="auto" w:val="clear"/>
-            <w:tcMar>
-              <w:top w:type="dxa" w:w="70"/>
-              <w:left w:type="dxa" w:w="110"/>
-              <w:bottom w:type="dxa" w:w="70"/>
-              <w:right w:type="dxa" w:w="110"/>
-            </w:tcMar>
-          </w:tcPr>
-          <w:p>
-            <w:pPr>
-              <w:jc w:val="center"/>
-            </w:pPr>
-            <w:r>
-              <w:rPr>
-                <w:rFonts w:ascii="Calibri" w:cs="Calibri" w:eastAsia="Calibri" w:hAnsi="Calibri"/>
-                <w:b w:val="false"/>
-                <w:bCs w:val="false"/>
-                <w:sz w:val="20"/>
-                <w:szCs w:val="20"/>
-              </w:rPr>
-              <w:t xml:space="preserve">≈ 12 %</w:t>
+              <w:t xml:space="preserve">compute_image_statistics</w:t>
+            </w:r>
+          </w:p>
+        </w:tc>
+        <w:tc>
+          <w:tcPr>
+            <w:tcW w:type="dxa" w:w="1500"/>
+            <w:tcBorders>
+              <w:top w:val="single" w:color="BFBFBF" w:sz="4"/>
+              <w:left w:val="single" w:color="BFBFBF" w:sz="4"/>
+              <w:bottom w:val="single" w:color="BFBFBF" w:sz="4"/>
+              <w:right w:val="single" w:color="BFBFBF" w:sz="4"/>
+            </w:tcBorders>
+            <w:tcMar>
+              <w:top w:type="dxa" w:w="70"/>
+              <w:left w:type="dxa" w:w="110"/>
+              <w:bottom w:type="dxa" w:w="70"/>
+              <w:right w:type="dxa" w:w="110"/>
+            </w:tcMar>
+          </w:tcPr>
+          <w:p>
+            <w:pPr>
+              <w:jc w:val="center"/>
+            </w:pPr>
+            <w:r>
+              <w:rPr>
+                <w:rFonts w:ascii="Calibri" w:cs="Calibri" w:eastAsia="Calibri" w:hAnsi="Calibri"/>
+                <w:b w:val="false"/>
+                <w:bCs w:val="false"/>
+                <w:sz w:val="20"/>
+                <w:szCs w:val="20"/>
+              </w:rPr>
+              <w:t xml:space="preserve">≈ 9 %</w:t>
+            </w:r>
+          </w:p>
+        </w:tc>
+        <w:tc>
+          <w:tcPr>
+            <w:tcW w:type="dxa" w:w="2400"/>
+            <w:tcBorders>
+              <w:top w:val="single" w:color="BFBFBF" w:sz="4"/>
+              <w:left w:val="single" w:color="BFBFBF" w:sz="4"/>
+              <w:bottom w:val="single" w:color="BFBFBF" w:sz="4"/>
+              <w:right w:val="single" w:color="BFBFBF" w:sz="4"/>
+            </w:tcBorders>
+            <w:tcMar>
+              <w:top w:type="dxa" w:w="70"/>
+              <w:left w:type="dxa" w:w="110"/>
+              <w:bottom w:type="dxa" w:w="70"/>
+              <w:right w:type="dxa" w:w="110"/>
+            </w:tcMar>
+          </w:tcPr>
+          <w:p>
+            <w:pPr>
+              <w:jc w:val="center"/>
+            </w:pPr>
+            <w:r>
+              <w:rPr>
+                <w:rFonts w:ascii="Calibri" w:cs="Calibri" w:eastAsia="Calibri" w:hAnsi="Calibri"/>
+                <w:b w:val="false"/>
+                <w:bCs w:val="false"/>
+                <w:sz w:val="20"/>
+                <w:szCs w:val="20"/>
+              </w:rPr>
+              <w:t xml:space="preserve">0,208</w:t>
+            </w:r>
+          </w:p>
+        </w:tc>
+        <w:tc>
+          <w:tcPr>
+            <w:tcW w:type="dxa" w:w="2438"/>
+            <w:tcBorders>
+              <w:top w:val="single" w:color="BFBFBF" w:sz="4"/>
+              <w:left w:val="single" w:color="BFBFBF" w:sz="4"/>
+              <w:bottom w:val="single" w:color="BFBFBF" w:sz="4"/>
+              <w:right w:val="single" w:color="BFBFBF" w:sz="4"/>
+            </w:tcBorders>
+            <w:tcMar>
+              <w:top w:type="dxa" w:w="70"/>
+              <w:left w:type="dxa" w:w="110"/>
+              <w:bottom w:type="dxa" w:w="70"/>
+              <w:right w:type="dxa" w:w="110"/>
+            </w:tcMar>
+          </w:tcPr>
+          <w:p>
+            <w:pPr>
+              <w:jc w:val="center"/>
+            </w:pPr>
+            <w:r>
+              <w:rPr>
+                <w:rFonts w:ascii="Calibri" w:cs="Calibri" w:eastAsia="Calibri" w:hAnsi="Calibri"/>
+                <w:b w:val="false"/>
+                <w:bCs w:val="false"/>
+                <w:sz w:val="20"/>
+                <w:szCs w:val="20"/>
+              </w:rPr>
+              <w:t xml:space="preserve">0,0015  (× 143)</w:t>
             </w:r>
           </w:p>
         </w:tc>
@@ -4016,13 +3602,14 @@
       <w:tr>
         <w:tc>
           <w:tcPr>
-            <w:tcW w:type="dxa" w:w="3700"/>
-            <w:tcBorders>
-              <w:top w:val="single" w:color="BFBFBF" w:sz="4"/>
-              <w:left w:val="single" w:color="BFBFBF" w:sz="4"/>
-              <w:bottom w:val="single" w:color="BFBFBF" w:sz="4"/>
-              <w:right w:val="single" w:color="BFBFBF" w:sz="4"/>
-            </w:tcBorders>
+            <w:tcW w:type="dxa" w:w="3300"/>
+            <w:tcBorders>
+              <w:top w:val="single" w:color="BFBFBF" w:sz="4"/>
+              <w:left w:val="single" w:color="BFBFBF" w:sz="4"/>
+              <w:bottom w:val="single" w:color="BFBFBF" w:sz="4"/>
+              <w:right w:val="single" w:color="BFBFBF" w:sz="4"/>
+            </w:tcBorders>
+            <w:shd w:fill="F2F2F2" w:color="auto" w:val="clear"/>
             <w:tcMar>
               <w:top w:type="dxa" w:w="70"/>
               <w:left w:type="dxa" w:w="110"/>
@@ -4042,111 +3629,13 @@
                 <w:sz w:val="20"/>
                 <w:szCs w:val="20"/>
               </w:rPr>
-              <w:t xml:space="preserve">compute_image_statistics</w:t>
-            </w:r>
-          </w:p>
-        </w:tc>
-        <w:tc>
-          <w:tcPr>
-            <w:tcW w:type="dxa" w:w="1300"/>
-            <w:tcBorders>
-              <w:top w:val="single" w:color="BFBFBF" w:sz="4"/>
-              <w:left w:val="single" w:color="BFBFBF" w:sz="4"/>
-              <w:bottom w:val="single" w:color="BFBFBF" w:sz="4"/>
-              <w:right w:val="single" w:color="BFBFBF" w:sz="4"/>
-            </w:tcBorders>
-            <w:tcMar>
-              <w:top w:type="dxa" w:w="70"/>
-              <w:left w:type="dxa" w:w="110"/>
-              <w:bottom w:type="dxa" w:w="70"/>
-              <w:right w:type="dxa" w:w="110"/>
-            </w:tcMar>
-          </w:tcPr>
-          <w:p>
-            <w:pPr>
-              <w:jc w:val="center"/>
-            </w:pPr>
-            <w:r>
-              <w:rPr>
-                <w:rFonts w:ascii="Calibri" w:cs="Calibri" w:eastAsia="Calibri" w:hAnsi="Calibri"/>
-                <w:b w:val="false"/>
-                <w:bCs w:val="false"/>
-                <w:sz w:val="20"/>
-                <w:szCs w:val="20"/>
-              </w:rPr>
-              <w:t xml:space="preserve">24</w:t>
-            </w:r>
-          </w:p>
-        </w:tc>
-        <w:tc>
-          <w:tcPr>
-            <w:tcW w:type="dxa" w:w="2300"/>
-            <w:tcBorders>
-              <w:top w:val="single" w:color="BFBFBF" w:sz="4"/>
-              <w:left w:val="single" w:color="BFBFBF" w:sz="4"/>
-              <w:bottom w:val="single" w:color="BFBFBF" w:sz="4"/>
-              <w:right w:val="single" w:color="BFBFBF" w:sz="4"/>
-            </w:tcBorders>
-            <w:tcMar>
-              <w:top w:type="dxa" w:w="70"/>
-              <w:left w:type="dxa" w:w="110"/>
-              <w:bottom w:type="dxa" w:w="70"/>
-              <w:right w:type="dxa" w:w="110"/>
-            </w:tcMar>
-          </w:tcPr>
-          <w:p>
-            <w:pPr>
-              <w:jc w:val="center"/>
-            </w:pPr>
-            <w:r>
-              <w:rPr>
-                <w:rFonts w:ascii="Calibri" w:cs="Calibri" w:eastAsia="Calibri" w:hAnsi="Calibri"/>
-                <w:b w:val="false"/>
-                <w:bCs w:val="false"/>
-                <w:sz w:val="20"/>
-                <w:szCs w:val="20"/>
-              </w:rPr>
-              <w:t xml:space="preserve">0,44</w:t>
-            </w:r>
-          </w:p>
-        </w:tc>
-        <w:tc>
-          <w:tcPr>
-            <w:tcW w:type="dxa" w:w="2338"/>
-            <w:tcBorders>
-              <w:top w:val="single" w:color="BFBFBF" w:sz="4"/>
-              <w:left w:val="single" w:color="BFBFBF" w:sz="4"/>
-              <w:bottom w:val="single" w:color="BFBFBF" w:sz="4"/>
-              <w:right w:val="single" w:color="BFBFBF" w:sz="4"/>
-            </w:tcBorders>
-            <w:tcMar>
-              <w:top w:type="dxa" w:w="70"/>
-              <w:left w:type="dxa" w:w="110"/>
-              <w:bottom w:type="dxa" w:w="70"/>
-              <w:right w:type="dxa" w:w="110"/>
-            </w:tcMar>
-          </w:tcPr>
-          <w:p>
-            <w:pPr>
-              <w:jc w:val="center"/>
-            </w:pPr>
-            <w:r>
-              <w:rPr>
-                <w:rFonts w:ascii="Calibri" w:cs="Calibri" w:eastAsia="Calibri" w:hAnsi="Calibri"/>
-                <w:b w:val="false"/>
-                <w:bCs w:val="false"/>
-                <w:sz w:val="20"/>
-                <w:szCs w:val="20"/>
-              </w:rPr>
-              <w:t xml:space="preserve">≈ 9 %</w:t>
-            </w:r>
-          </w:p>
-        </w:tc>
-      </w:tr>
-      <w:tr>
-        <w:tc>
-          <w:tcPr>
-            <w:tcW w:type="dxa" w:w="3700"/>
+              <w:t xml:space="preserve">load_image</w:t>
+            </w:r>
+          </w:p>
+        </w:tc>
+        <w:tc>
+          <w:tcPr>
+            <w:tcW w:type="dxa" w:w="1500"/>
             <w:tcBorders>
               <w:top w:val="single" w:color="BFBFBF" w:sz="4"/>
               <w:left w:val="single" w:color="BFBFBF" w:sz="4"/>
@@ -4163,23 +3652,23 @@
           </w:tcPr>
           <w:p>
             <w:pPr>
-              <w:jc w:val="left"/>
-            </w:pPr>
-            <w:r>
-              <w:rPr>
-                <w:rFonts w:ascii="Calibri" w:cs="Calibri" w:eastAsia="Calibri" w:hAnsi="Calibri"/>
-                <w:b w:val="false"/>
-                <w:bCs w:val="false"/>
-                <w:sz w:val="20"/>
-                <w:szCs w:val="20"/>
-              </w:rPr>
-              <w:t xml:space="preserve">load_image</w:t>
-            </w:r>
-          </w:p>
-        </w:tc>
-        <w:tc>
-          <w:tcPr>
-            <w:tcW w:type="dxa" w:w="1300"/>
+              <w:jc w:val="center"/>
+            </w:pPr>
+            <w:r>
+              <w:rPr>
+                <w:rFonts w:ascii="Calibri" w:cs="Calibri" w:eastAsia="Calibri" w:hAnsi="Calibri"/>
+                <w:b w:val="false"/>
+                <w:bCs w:val="false"/>
+                <w:sz w:val="20"/>
+                <w:szCs w:val="20"/>
+              </w:rPr>
+              <w:t xml:space="preserve">≈ 0,3 %</w:t>
+            </w:r>
+          </w:p>
+        </w:tc>
+        <w:tc>
+          <w:tcPr>
+            <w:tcW w:type="dxa" w:w="2400"/>
             <w:tcBorders>
               <w:top w:val="single" w:color="BFBFBF" w:sz="4"/>
               <w:left w:val="single" w:color="BFBFBF" w:sz="4"/>
@@ -4206,13 +3695,13 @@
                 <w:sz w:val="20"/>
                 <w:szCs w:val="20"/>
               </w:rPr>
-              <w:t xml:space="preserve">24</w:t>
-            </w:r>
-          </w:p>
-        </w:tc>
-        <w:tc>
-          <w:tcPr>
-            <w:tcW w:type="dxa" w:w="2300"/>
+              <w:t xml:space="preserve">0,016</w:t>
+            </w:r>
+          </w:p>
+        </w:tc>
+        <w:tc>
+          <w:tcPr>
+            <w:tcW w:type="dxa" w:w="2438"/>
             <w:tcBorders>
               <w:top w:val="single" w:color="BFBFBF" w:sz="4"/>
               <w:left w:val="single" w:color="BFBFBF" w:sz="4"/>
@@ -4239,40 +3728,7 @@
                 <w:sz w:val="20"/>
                 <w:szCs w:val="20"/>
               </w:rPr>
-              <w:t xml:space="preserve">0,016</w:t>
-            </w:r>
-          </w:p>
-        </w:tc>
-        <w:tc>
-          <w:tcPr>
-            <w:tcW w:type="dxa" w:w="2338"/>
-            <w:tcBorders>
-              <w:top w:val="single" w:color="BFBFBF" w:sz="4"/>
-              <w:left w:val="single" w:color="BFBFBF" w:sz="4"/>
-              <w:bottom w:val="single" w:color="BFBFBF" w:sz="4"/>
-              <w:right w:val="single" w:color="BFBFBF" w:sz="4"/>
-            </w:tcBorders>
-            <w:shd w:fill="F2F2F2" w:color="auto" w:val="clear"/>
-            <w:tcMar>
-              <w:top w:type="dxa" w:w="70"/>
-              <w:left w:type="dxa" w:w="110"/>
-              <w:bottom w:type="dxa" w:w="70"/>
-              <w:right w:type="dxa" w:w="110"/>
-            </w:tcMar>
-          </w:tcPr>
-          <w:p>
-            <w:pPr>
-              <w:jc w:val="center"/>
-            </w:pPr>
-            <w:r>
-              <w:rPr>
-                <w:rFonts w:ascii="Calibri" w:cs="Calibri" w:eastAsia="Calibri" w:hAnsi="Calibri"/>
-                <w:b w:val="false"/>
-                <w:bCs w:val="false"/>
-                <w:sz w:val="20"/>
-                <w:szCs w:val="20"/>
-              </w:rPr>
-              <w:t xml:space="preserve">≈ 0,3 %</w:t>
+              <w:t xml:space="preserve">inchangé</w:t>
             </w:r>
           </w:p>
         </w:tc>
@@ -4280,50 +3736,64 @@
     </w:tbl>
     <w:p>
       <w:pPr>
-        <w:spacing w:after="160" w:before="80"/>
+        <w:spacing w:after="80"/>
       </w:pPr>
       <w:r>
         <w:rPr>
           <w:rFonts w:ascii="Calibri" w:cs="Calibri" w:eastAsia="Calibri" w:hAnsi="Calibri"/>
           <w:i/>
           <w:iCs/>
+          <w:color w:val="595959"/>
+          <w:sz w:val="17"/>
+          <w:szCs w:val="17"/>
+        </w:rPr>
+        <w:t xml:space="preserve">Temps par étape : médiane de 3 exécutions avec python vectorized_version.py --compare, qui vérifie aussi l'égalité des résultats.</w:t>
+      </w:r>
+    </w:p>
+    <w:p>
+      <w:pPr>
+        <w:spacing w:after="80" w:line="260"/>
+      </w:pPr>
+      <w:r>
+        <w:rPr>
+          <w:rFonts w:ascii="Calibri" w:cs="Calibri" w:eastAsia="Calibri" w:hAnsi="Calibri"/>
           <w:sz w:val="20"/>
           <w:szCs w:val="20"/>
         </w:rPr>
-        <w:t xml:space="preserve">Sous le profileur, le programme met 5,1 s au lieu de 2,84 s : cProfile ajoute un coût à chaque appel de fonction. On utilise donc les </w:t>
-      </w:r>
-      <w:r>
-        <w:rPr>
-          <w:rFonts w:ascii="Calibri" w:cs="Calibri" w:eastAsia="Calibri" w:hAnsi="Calibri"/>
-          <w:b/>
-          <w:bCs/>
-          <w:i/>
-          <w:iCs/>
+        <w:t xml:space="preserve">Le filtre 3×3 est le goulot principal : il lit 9 valeurs par pixel dans quatre boucles Python imbriquées. Le programme est limité par le calcul, pas par les fichiers. D'après la loi d'Amdahl, n'accélérer que le filtre plafonnerait le gain à ≈ × 4 : il faut traiter les trois étapes de calcul.</w:t>
+      </w:r>
+    </w:p>
+    <w:p>
+      <w:pPr>
+        <w:pStyle w:val="Heading2"/>
+      </w:pPr>
+      <w:r>
+        <w:rPr>
+          <w:rFonts w:ascii="Calibri" w:cs="Calibri" w:eastAsia="Calibri" w:hAnsi="Calibri"/>
+        </w:rPr>
+        <w:t xml:space="preserve">2.2 Vectorisation NumPy</w:t>
+      </w:r>
+    </w:p>
+    <w:p>
+      <w:pPr>
+        <w:spacing w:after="80" w:line="260"/>
+      </w:pPr>
+      <w:r>
+        <w:rPr>
+          <w:rFonts w:ascii="Consolas" w:cs="Consolas" w:eastAsia="Consolas" w:hAnsi="Consolas"/>
+          <w:color w:val="1F3864"/>
           <w:sz w:val="20"/>
           <w:szCs w:val="20"/>
         </w:rPr>
-        <w:t xml:space="preserve">proportions</w:t>
-      </w:r>
-      <w:r>
-        <w:rPr>
-          <w:rFonts w:ascii="Calibri" w:cs="Calibri" w:eastAsia="Calibri" w:hAnsi="Calibri"/>
-          <w:i/>
-          <w:iCs/>
+        <w:t xml:space="preserve">vectorized_version.py</w:t>
+      </w:r>
+      <w:r>
+        <w:rPr>
+          <w:rFonts w:ascii="Calibri" w:cs="Calibri" w:eastAsia="Calibri" w:hAnsi="Calibri"/>
           <w:sz w:val="20"/>
           <w:szCs w:val="20"/>
         </w:rPr>
-        <w:t xml:space="preserve"> du profilage, jamais ses temps absolus.</w:t>
-      </w:r>
-    </w:p>
-    <w:p>
-      <w:pPr>
-        <w:pStyle w:val="Heading2"/>
-      </w:pPr>
-      <w:r>
-        <w:rPr>
-          <w:rFonts w:ascii="Calibri" w:cs="Calibri" w:eastAsia="Calibri" w:hAnsi="Calibri"/>
-        </w:rPr>
-        <w:t xml:space="preserve">2.3 Goulots d'étranglement identifiés</w:t>
+        <w:t xml:space="preserve"> remplace les boucles par des opérations sur l'image entière, le reste du programme étant réutilisé tel quel :</w:t>
       </w:r>
     </w:p>
     <w:p>
@@ -4333,21 +3803,25 @@
           <w:ilvl w:val="0"/>
           <w:numId w:val="2"/>
         </w:numPr>
-        <w:spacing w:after="60"/>
+        <w:spacing w:after="40" w:line="252"/>
       </w:pPr>
       <w:r>
         <w:rPr>
           <w:rFonts w:ascii="Calibri" w:cs="Calibri" w:eastAsia="Calibri" w:hAnsi="Calibri"/>
           <w:b/>
           <w:bCs/>
-        </w:rPr>
-        <w:t xml:space="preserve">Le filtre 3×3 est le point chaud principal (≈ 77 % du temps). </w:t>
-      </w:r>
-      <w:r>
-        <w:rPr>
-          <w:rFonts w:ascii="Calibri" w:cs="Calibri" w:eastAsia="Calibri" w:hAnsi="Calibri"/>
-        </w:rPr>
-        <w:t xml:space="preserve">Il lit 9 valeurs par pixel à travers quatre boucles Python imbriquées, contre une seule valeur pour la normalisation et les statistiques.</w:t>
+          <w:sz w:val="20"/>
+          <w:szCs w:val="20"/>
+        </w:rPr>
+        <w:t xml:space="preserve">normalisation</w:t>
+      </w:r>
+      <w:r>
+        <w:rPr>
+          <w:rFonts w:ascii="Calibri" w:cs="Calibri" w:eastAsia="Calibri" w:hAnsi="Calibri"/>
+          <w:sz w:val="20"/>
+          <w:szCs w:val="20"/>
+        </w:rPr>
+        <w:t xml:space="preserve"> : (image − min) / écart en une seule opération ;</w:t>
       </w:r>
     </w:p>
     <w:p>
@@ -4357,21 +3831,25 @@
           <w:ilvl w:val="0"/>
           <w:numId w:val="2"/>
         </w:numPr>
-        <w:spacing w:after="60"/>
+        <w:spacing w:after="40" w:line="252"/>
       </w:pPr>
       <w:r>
         <w:rPr>
           <w:rFonts w:ascii="Calibri" w:cs="Calibri" w:eastAsia="Calibri" w:hAnsi="Calibri"/>
           <w:b/>
           <w:bCs/>
-        </w:rPr>
-        <w:t xml:space="preserve">Le programme est limité par le calcul, pas par les fichiers. </w:t>
-      </w:r>
-      <w:r>
-        <w:rPr>
-          <w:rFonts w:ascii="Calibri" w:cs="Calibri" w:eastAsia="Calibri" w:hAnsi="Calibri"/>
-        </w:rPr>
-        <w:t xml:space="preserve">Le chargement des 24 images ne prend que 16 ms (0,3 %). Conséquence pour le rôle 2 : des threads pour la lecture ne peuvent presque rien gagner, et le GIL empêche les threads d'accélérer le calcul Python.</w:t>
+          <w:sz w:val="20"/>
+          <w:szCs w:val="20"/>
+        </w:rPr>
+        <w:t xml:space="preserve">filtre 3×3</w:t>
+      </w:r>
+      <w:r>
+        <w:rPr>
+          <w:rFonts w:ascii="Calibri" w:cs="Calibri" w:eastAsia="Calibri" w:hAnsi="Calibri"/>
+          <w:sz w:val="20"/>
+          <w:szCs w:val="20"/>
+        </w:rPr>
+        <w:t xml:space="preserve"> : somme de 9 copies décalées de l'image (découpage par tranches), puis division par 9 ;</w:t>
       </w:r>
     </w:p>
     <w:p>
@@ -4381,21 +3859,174 @@
           <w:ilvl w:val="0"/>
           <w:numId w:val="2"/>
         </w:numPr>
-        <w:spacing w:after="60"/>
+        <w:spacing w:after="40" w:line="252"/>
       </w:pPr>
       <w:r>
         <w:rPr>
           <w:rFonts w:ascii="Calibri" w:cs="Calibri" w:eastAsia="Calibri" w:hAnsi="Calibri"/>
           <w:b/>
           <w:bCs/>
-        </w:rPr>
-        <w:t xml:space="preserve">Loi d'Amdahl : </w:t>
-      </w:r>
-      <w:r>
-        <w:rPr>
-          <w:rFonts w:ascii="Calibri" w:cs="Calibri" w:eastAsia="Calibri" w:hAnsi="Calibri"/>
-        </w:rPr>
-        <w:t xml:space="preserve">accélérer uniquement le filtre limiterait le gain à environ ×4 (il resterait les 23 % des autres étapes). Il faut donc optimiser les trois étapes de calcul.</w:t>
+          <w:sz w:val="20"/>
+          <w:szCs w:val="20"/>
+        </w:rPr>
+        <w:t xml:space="preserve">statistiques</w:t>
+      </w:r>
+      <w:r>
+        <w:rPr>
+          <w:rFonts w:ascii="Calibri" w:cs="Calibri" w:eastAsia="Calibri" w:hAnsi="Calibri"/>
+          <w:sz w:val="20"/>
+          <w:szCs w:val="20"/>
+        </w:rPr>
+        <w:t xml:space="preserve"> : sum(), max() et count_nonzero(image ≥ seuil).</w:t>
+      </w:r>
+    </w:p>
+    <w:p>
+      <w:pPr>
+        <w:spacing w:after="80" w:line="260"/>
+      </w:pPr>
+      <w:r>
+        <w:rPr>
+          <w:rFonts w:ascii="Calibri" w:cs="Calibri" w:eastAsia="Calibri" w:hAnsi="Calibri"/>
+          <w:b/>
+          <w:bCs/>
+          <w:sz w:val="20"/>
+          <w:szCs w:val="20"/>
+        </w:rPr>
+        <w:t xml:space="preserve">Résultats identiques au bit près : </w:t>
+      </w:r>
+      <w:r>
+        <w:rPr>
+          <w:rFonts w:ascii="Calibri" w:cs="Calibri" w:eastAsia="Calibri" w:hAnsi="Calibri"/>
+          <w:sz w:val="20"/>
+          <w:szCs w:val="20"/>
+        </w:rPr>
+        <w:t xml:space="preserve">les calculs sont faits en float64 puis rangés en float32, et les 9 voisins sont additionnés dans le même ordre que les boucles (vérifié par np.array_equal sur les 24 images ; résumé global identique).</w:t>
+      </w:r>
+    </w:p>
+    <w:p>
+      <w:pPr>
+        <w:spacing w:after="80" w:line="260"/>
+      </w:pPr>
+      <w:r>
+        <w:rPr>
+          <w:rFonts w:ascii="Calibri" w:cs="Calibri" w:eastAsia="Calibri" w:hAnsi="Calibri"/>
+          <w:sz w:val="20"/>
+          <w:szCs w:val="20"/>
+        </w:rPr>
+        <w:t xml:space="preserve">Pipeline complet (3 exécutions) : 0,0395 / 0,0346 / 0,0384 s, soit </w:t>
+      </w:r>
+      <w:r>
+        <w:rPr>
+          <w:rFonts w:ascii="Calibri" w:cs="Calibri" w:eastAsia="Calibri" w:hAnsi="Calibri"/>
+          <w:b/>
+          <w:bCs/>
+          <w:sz w:val="20"/>
+          <w:szCs w:val="20"/>
+        </w:rPr>
+        <w:t xml:space="preserve">0,038 s contre 2,84 s : speedup ≈ × 74</w:t>
+      </w:r>
+      <w:r>
+        <w:rPr>
+          <w:rFonts w:ascii="Calibri" w:cs="Calibri" w:eastAsia="Calibri" w:hAnsi="Calibri"/>
+          <w:sz w:val="20"/>
+          <w:szCs w:val="20"/>
+        </w:rPr>
+        <w:t xml:space="preserve"> sur un seul cœur.</w:t>
+      </w:r>
+    </w:p>
+    <w:p>
+      <w:pPr>
+        <w:pStyle w:val="Heading2"/>
+      </w:pPr>
+      <w:r>
+        <w:rPr>
+          <w:rFonts w:ascii="Calibri" w:cs="Calibri" w:eastAsia="Calibri" w:hAnsi="Calibri"/>
+        </w:rPr>
+        <w:t xml:space="preserve">2.3 Analyse</w:t>
+      </w:r>
+    </w:p>
+    <w:p>
+      <w:pPr>
+        <w:pStyle w:val="ListParagraph"/>
+        <w:numPr>
+          <w:ilvl w:val="0"/>
+          <w:numId w:val="2"/>
+        </w:numPr>
+        <w:spacing w:after="40" w:line="252"/>
+      </w:pPr>
+      <w:r>
+        <w:rPr>
+          <w:rFonts w:ascii="Calibri" w:cs="Calibri" w:eastAsia="Calibri" w:hAnsi="Calibri"/>
+          <w:b/>
+          <w:bCs/>
+          <w:sz w:val="20"/>
+          <w:szCs w:val="20"/>
+        </w:rPr>
+        <w:t xml:space="preserve">Toutes les étapes de calcul gagnent un facteur &gt; 100 ; </w:t>
+      </w:r>
+      <w:r>
+        <w:rPr>
+          <w:rFonts w:ascii="Calibri" w:cs="Calibri" w:eastAsia="Calibri" w:hAnsi="Calibri"/>
+          <w:sz w:val="20"/>
+          <w:szCs w:val="20"/>
+        </w:rPr>
+        <w:t xml:space="preserve">le filtre gagne le plus (× 172) car c'est lui qui faisait le plus de travail dans l'interpréteur. NumPy exécute la boucle en code compilé, sur des données contiguës, avec des instructions SIMD.</w:t>
+      </w:r>
+    </w:p>
+    <w:p>
+      <w:pPr>
+        <w:pStyle w:val="ListParagraph"/>
+        <w:numPr>
+          <w:ilvl w:val="0"/>
+          <w:numId w:val="2"/>
+        </w:numPr>
+        <w:spacing w:after="40" w:line="252"/>
+      </w:pPr>
+      <w:r>
+        <w:rPr>
+          <w:rFonts w:ascii="Calibri" w:cs="Calibri" w:eastAsia="Calibri" w:hAnsi="Calibri"/>
+          <w:b/>
+          <w:bCs/>
+          <w:sz w:val="20"/>
+          <w:szCs w:val="20"/>
+        </w:rPr>
+        <w:t xml:space="preserve">Le goulot change de place : </w:t>
+      </w:r>
+      <w:r>
+        <w:rPr>
+          <w:rFonts w:ascii="Calibri" w:cs="Calibri" w:eastAsia="Calibri" w:hAnsi="Calibri"/>
+          <w:sz w:val="20"/>
+          <w:szCs w:val="20"/>
+        </w:rPr>
+        <w:t xml:space="preserve">le pipeline complet ne gagne que × 74 contre × 163 pour le calcul seul, car le chargement des fichiers (≈ 16 ms, inchangé) pèse désormais une part importante du temps restant, contre 0,3 % avant.</w:t>
+      </w:r>
+    </w:p>
+    <w:p>
+      <w:pPr>
+        <w:pStyle w:val="ListParagraph"/>
+        <w:numPr>
+          <w:ilvl w:val="0"/>
+          <w:numId w:val="2"/>
+        </w:numPr>
+        <w:spacing w:after="40" w:line="252"/>
+      </w:pPr>
+      <w:r>
+        <w:rPr>
+          <w:rFonts w:ascii="Calibri" w:cs="Calibri" w:eastAsia="Calibri" w:hAnsi="Calibri"/>
+          <w:b/>
+          <w:bCs/>
+          <w:sz w:val="20"/>
+          <w:szCs w:val="20"/>
+        </w:rPr>
+        <w:t xml:space="preserve">Conséquence pour la suite : </w:t>
+      </w:r>
+      <w:r>
+        <w:rPr>
+          <w:rFonts w:ascii="Calibri" w:cs="Calibri" w:eastAsia="Calibri" w:hAnsi="Calibri"/>
+          <w:sz w:val="20"/>
+          <w:szCs w:val="20"/>
+        </w:rPr>
+        <w:t xml:space="preserve">la vectorisation est complémentaire du parallélisme (fonctions réutilisables en multiprocessing et MPI), mais avec moins de 2 ms de calcul par image, les coûts de lancement et de communication limiteront les gains.</w:t>
       </w:r>
     </w:p>
     <w:p>
@@ -4411,18 +4042,7 @@
         <w:rPr>
           <w:rFonts w:ascii="Calibri" w:cs="Calibri" w:eastAsia="Calibri" w:hAnsi="Calibri"/>
         </w:rPr>
-        <w:t xml:space="preserve">3. Partie 2 – Vectorisation NumPy (Rôle 1)</w:t>
-      </w:r>
-    </w:p>
-    <w:p>
-      <w:pPr>
-        <w:pStyle w:val="Heading2"/>
-      </w:pPr>
-      <w:r>
-        <w:rPr>
-          <w:rFonts w:ascii="Calibri" w:cs="Calibri" w:eastAsia="Calibri" w:hAnsi="Calibri"/>
-        </w:rPr>
-        <w:t xml:space="preserve">3.1 Principe</w:t>
+        <w:t xml:space="preserve">3. Partie 3 – Multithreading (Rôle 2)</w:t>
       </w:r>
     </w:p>
     <w:p>
@@ -4433,7 +4053,7 @@
         <w:rPr>
           <w:rFonts w:ascii="Calibri" w:cs="Calibri" w:eastAsia="Calibri" w:hAnsi="Calibri"/>
         </w:rPr>
-        <w:t xml:space="preserve">Le fichier </w:t>
+        <w:t xml:space="preserve">Fichier : </w:t>
       </w:r>
       <w:r>
         <w:rPr>
@@ -4442,456 +4062,24 @@
           <w:sz w:val="20"/>
           <w:szCs w:val="20"/>
         </w:rPr>
-        <w:t xml:space="preserve">vectorized_version.py</w:t>
-      </w:r>
-      <w:r>
-        <w:rPr>
-          <w:rFonts w:ascii="Calibri" w:cs="Calibri" w:eastAsia="Calibri" w:hAnsi="Calibri"/>
-        </w:rPr>
-        <w:t xml:space="preserve"> réécrit les trois fonctions de calcul avec des opérations NumPy sur l'image entière, au lieu de boucles Python pixel par pixel. Le reste du programme (chargement, agrégation, CSV) est réutilisé tel quel depuis </w:t>
-      </w:r>
-      <w:r>
-        <w:rPr>
-          <w:rFonts w:ascii="Consolas" w:cs="Consolas" w:eastAsia="Consolas" w:hAnsi="Consolas"/>
-          <w:color w:val="1F3864"/>
-          <w:sz w:val="20"/>
-          <w:szCs w:val="20"/>
-        </w:rPr>
-        <w:t xml:space="preserve">sequential_pipeline.py</w:t>
-      </w:r>
-      <w:r>
-        <w:rPr>
-          <w:rFonts w:ascii="Calibri" w:cs="Calibri" w:eastAsia="Calibri" w:hAnsi="Calibri"/>
-        </w:rPr>
-        <w:t xml:space="preserve">, pour que la seule différence entre les deux versions soit la vectorisation.</w:t>
-      </w:r>
-    </w:p>
-    <w:tbl>
-      <w:tblPr>
-        <w:tblW w:type="dxa" w:w="9638"/>
-        <w:tblBorders>
-          <w:top w:val="single" w:color="auto" w:sz="4"/>
-          <w:left w:val="single" w:color="auto" w:sz="4"/>
-          <w:bottom w:val="single" w:color="auto" w:sz="4"/>
-          <w:right w:val="single" w:color="auto" w:sz="4"/>
-          <w:insideH w:val="single" w:color="auto" w:sz="4"/>
-          <w:insideV w:val="single" w:color="auto" w:sz="4"/>
-        </w:tblBorders>
-      </w:tblPr>
-      <w:tblGrid>
-        <w:gridCol w:w="2700"/>
-        <w:gridCol w:w="3300"/>
-        <w:gridCol w:w="3638"/>
-      </w:tblGrid>
-      <w:tr>
-        <w:trPr>
-          <w:tblHeader/>
-        </w:trPr>
-        <w:tc>
-          <w:tcPr>
-            <w:tcW w:type="dxa" w:w="2700"/>
-            <w:tcBorders>
-              <w:top w:val="single" w:color="BFBFBF" w:sz="4"/>
-              <w:left w:val="single" w:color="BFBFBF" w:sz="4"/>
-              <w:bottom w:val="single" w:color="BFBFBF" w:sz="4"/>
-              <w:right w:val="single" w:color="BFBFBF" w:sz="4"/>
-            </w:tcBorders>
-            <w:shd w:fill="1F3864" w:color="auto" w:val="clear"/>
-            <w:tcMar>
-              <w:top w:type="dxa" w:w="70"/>
-              <w:left w:type="dxa" w:w="110"/>
-              <w:bottom w:type="dxa" w:w="70"/>
-              <w:right w:type="dxa" w:w="110"/>
-            </w:tcMar>
-          </w:tcPr>
-          <w:p>
-            <w:pPr>
-              <w:jc w:val="left"/>
-            </w:pPr>
-            <w:r>
-              <w:rPr>
-                <w:rFonts w:ascii="Calibri" w:cs="Calibri" w:eastAsia="Calibri" w:hAnsi="Calibri"/>
-                <w:b/>
-                <w:bCs/>
-                <w:color w:val="FFFFFF"/>
-                <w:sz w:val="20"/>
-                <w:szCs w:val="20"/>
-              </w:rPr>
-              <w:t xml:space="preserve">Fonction</w:t>
-            </w:r>
-          </w:p>
-        </w:tc>
-        <w:tc>
-          <w:tcPr>
-            <w:tcW w:type="dxa" w:w="3300"/>
-            <w:tcBorders>
-              <w:top w:val="single" w:color="BFBFBF" w:sz="4"/>
-              <w:left w:val="single" w:color="BFBFBF" w:sz="4"/>
-              <w:bottom w:val="single" w:color="BFBFBF" w:sz="4"/>
-              <w:right w:val="single" w:color="BFBFBF" w:sz="4"/>
-            </w:tcBorders>
-            <w:shd w:fill="1F3864" w:color="auto" w:val="clear"/>
-            <w:tcMar>
-              <w:top w:type="dxa" w:w="70"/>
-              <w:left w:type="dxa" w:w="110"/>
-              <w:bottom w:type="dxa" w:w="70"/>
-              <w:right w:type="dxa" w:w="110"/>
-            </w:tcMar>
-          </w:tcPr>
-          <w:p>
-            <w:pPr>
-              <w:jc w:val="left"/>
-            </w:pPr>
-            <w:r>
-              <w:rPr>
-                <w:rFonts w:ascii="Calibri" w:cs="Calibri" w:eastAsia="Calibri" w:hAnsi="Calibri"/>
-                <w:b/>
-                <w:bCs/>
-                <w:color w:val="FFFFFF"/>
-                <w:sz w:val="20"/>
-                <w:szCs w:val="20"/>
-              </w:rPr>
-              <w:t xml:space="preserve">Version séquentielle</w:t>
-            </w:r>
-          </w:p>
-        </w:tc>
-        <w:tc>
-          <w:tcPr>
-            <w:tcW w:type="dxa" w:w="3638"/>
-            <w:tcBorders>
-              <w:top w:val="single" w:color="BFBFBF" w:sz="4"/>
-              <w:left w:val="single" w:color="BFBFBF" w:sz="4"/>
-              <w:bottom w:val="single" w:color="BFBFBF" w:sz="4"/>
-              <w:right w:val="single" w:color="BFBFBF" w:sz="4"/>
-            </w:tcBorders>
-            <w:shd w:fill="1F3864" w:color="auto" w:val="clear"/>
-            <w:tcMar>
-              <w:top w:type="dxa" w:w="70"/>
-              <w:left w:type="dxa" w:w="110"/>
-              <w:bottom w:type="dxa" w:w="70"/>
-              <w:right w:type="dxa" w:w="110"/>
-            </w:tcMar>
-          </w:tcPr>
-          <w:p>
-            <w:pPr>
-              <w:jc w:val="left"/>
-            </w:pPr>
-            <w:r>
-              <w:rPr>
-                <w:rFonts w:ascii="Calibri" w:cs="Calibri" w:eastAsia="Calibri" w:hAnsi="Calibri"/>
-                <w:b/>
-                <w:bCs/>
-                <w:color w:val="FFFFFF"/>
-                <w:sz w:val="20"/>
-                <w:szCs w:val="20"/>
-              </w:rPr>
-              <w:t xml:space="preserve">Version vectorisée</w:t>
-            </w:r>
-          </w:p>
-        </w:tc>
-      </w:tr>
-      <w:tr>
-        <w:tc>
-          <w:tcPr>
-            <w:tcW w:type="dxa" w:w="2700"/>
-            <w:tcBorders>
-              <w:top w:val="single" w:color="BFBFBF" w:sz="4"/>
-              <w:left w:val="single" w:color="BFBFBF" w:sz="4"/>
-              <w:bottom w:val="single" w:color="BFBFBF" w:sz="4"/>
-              <w:right w:val="single" w:color="BFBFBF" w:sz="4"/>
-            </w:tcBorders>
-            <w:tcMar>
-              <w:top w:type="dxa" w:w="70"/>
-              <w:left w:type="dxa" w:w="110"/>
-              <w:bottom w:type="dxa" w:w="70"/>
-              <w:right w:type="dxa" w:w="110"/>
-            </w:tcMar>
-          </w:tcPr>
-          <w:p>
-            <w:pPr>
-              <w:jc w:val="left"/>
-            </w:pPr>
-            <w:r>
-              <w:rPr>
-                <w:rFonts w:ascii="Calibri" w:cs="Calibri" w:eastAsia="Calibri" w:hAnsi="Calibri"/>
-                <w:b w:val="false"/>
-                <w:bCs w:val="false"/>
-                <w:sz w:val="20"/>
-                <w:szCs w:val="20"/>
-              </w:rPr>
-              <w:t xml:space="preserve">normalize_image</w:t>
-            </w:r>
-          </w:p>
-        </w:tc>
-        <w:tc>
-          <w:tcPr>
-            <w:tcW w:type="dxa" w:w="3300"/>
-            <w:tcBorders>
-              <w:top w:val="single" w:color="BFBFBF" w:sz="4"/>
-              <w:left w:val="single" w:color="BFBFBF" w:sz="4"/>
-              <w:bottom w:val="single" w:color="BFBFBF" w:sz="4"/>
-              <w:right w:val="single" w:color="BFBFBF" w:sz="4"/>
-            </w:tcBorders>
-            <w:tcMar>
-              <w:top w:type="dxa" w:w="70"/>
-              <w:left w:type="dxa" w:w="110"/>
-              <w:bottom w:type="dxa" w:w="70"/>
-              <w:right w:type="dxa" w:w="110"/>
-            </w:tcMar>
-          </w:tcPr>
-          <w:p>
-            <w:pPr>
-              <w:jc w:val="left"/>
-            </w:pPr>
-            <w:r>
-              <w:rPr>
-                <w:rFonts w:ascii="Calibri" w:cs="Calibri" w:eastAsia="Calibri" w:hAnsi="Calibri"/>
-                <w:b w:val="false"/>
-                <w:bCs w:val="false"/>
-                <w:sz w:val="20"/>
-                <w:szCs w:val="20"/>
-              </w:rPr>
-              <w:t xml:space="preserve">Double boucle : (pixel − min) / écart, pixel par pixel</w:t>
-            </w:r>
-          </w:p>
-        </w:tc>
-        <w:tc>
-          <w:tcPr>
-            <w:tcW w:type="dxa" w:w="3638"/>
-            <w:tcBorders>
-              <w:top w:val="single" w:color="BFBFBF" w:sz="4"/>
-              <w:left w:val="single" w:color="BFBFBF" w:sz="4"/>
-              <w:bottom w:val="single" w:color="BFBFBF" w:sz="4"/>
-              <w:right w:val="single" w:color="BFBFBF" w:sz="4"/>
-            </w:tcBorders>
-            <w:tcMar>
-              <w:top w:type="dxa" w:w="70"/>
-              <w:left w:type="dxa" w:w="110"/>
-              <w:bottom w:type="dxa" w:w="70"/>
-              <w:right w:type="dxa" w:w="110"/>
-            </w:tcMar>
-          </w:tcPr>
-          <w:p>
-            <w:pPr>
-              <w:jc w:val="left"/>
-            </w:pPr>
-            <w:r>
-              <w:rPr>
-                <w:rFonts w:ascii="Calibri" w:cs="Calibri" w:eastAsia="Calibri" w:hAnsi="Calibri"/>
-                <w:b w:val="false"/>
-                <w:bCs w:val="false"/>
-                <w:sz w:val="20"/>
-                <w:szCs w:val="20"/>
-              </w:rPr>
-              <w:t xml:space="preserve">Même formule appliquée à toute l'image en une opération</w:t>
-            </w:r>
-          </w:p>
-        </w:tc>
-      </w:tr>
-      <w:tr>
-        <w:tc>
-          <w:tcPr>
-            <w:tcW w:type="dxa" w:w="2700"/>
-            <w:tcBorders>
-              <w:top w:val="single" w:color="BFBFBF" w:sz="4"/>
-              <w:left w:val="single" w:color="BFBFBF" w:sz="4"/>
-              <w:bottom w:val="single" w:color="BFBFBF" w:sz="4"/>
-              <w:right w:val="single" w:color="BFBFBF" w:sz="4"/>
-            </w:tcBorders>
-            <w:shd w:fill="F2F2F2" w:color="auto" w:val="clear"/>
-            <w:tcMar>
-              <w:top w:type="dxa" w:w="70"/>
-              <w:left w:type="dxa" w:w="110"/>
-              <w:bottom w:type="dxa" w:w="70"/>
-              <w:right w:type="dxa" w:w="110"/>
-            </w:tcMar>
-          </w:tcPr>
-          <w:p>
-            <w:pPr>
-              <w:jc w:val="left"/>
-            </w:pPr>
-            <w:r>
-              <w:rPr>
-                <w:rFonts w:ascii="Calibri" w:cs="Calibri" w:eastAsia="Calibri" w:hAnsi="Calibri"/>
-                <w:b w:val="false"/>
-                <w:bCs w:val="false"/>
-                <w:sz w:val="20"/>
-                <w:szCs w:val="20"/>
-              </w:rPr>
-              <w:t xml:space="preserve">mean_filter_3x3</w:t>
-            </w:r>
-          </w:p>
-        </w:tc>
-        <w:tc>
-          <w:tcPr>
-            <w:tcW w:type="dxa" w:w="3300"/>
-            <w:tcBorders>
-              <w:top w:val="single" w:color="BFBFBF" w:sz="4"/>
-              <w:left w:val="single" w:color="BFBFBF" w:sz="4"/>
-              <w:bottom w:val="single" w:color="BFBFBF" w:sz="4"/>
-              <w:right w:val="single" w:color="BFBFBF" w:sz="4"/>
-            </w:tcBorders>
-            <w:shd w:fill="F2F2F2" w:color="auto" w:val="clear"/>
-            <w:tcMar>
-              <w:top w:type="dxa" w:w="70"/>
-              <w:left w:type="dxa" w:w="110"/>
-              <w:bottom w:type="dxa" w:w="70"/>
-              <w:right w:type="dxa" w:w="110"/>
-            </w:tcMar>
-          </w:tcPr>
-          <w:p>
-            <w:pPr>
-              <w:jc w:val="left"/>
-            </w:pPr>
-            <w:r>
-              <w:rPr>
-                <w:rFonts w:ascii="Calibri" w:cs="Calibri" w:eastAsia="Calibri" w:hAnsi="Calibri"/>
-                <w:b w:val="false"/>
-                <w:bCs w:val="false"/>
-                <w:sz w:val="20"/>
-                <w:szCs w:val="20"/>
-              </w:rPr>
-              <w:t xml:space="preserve">4 boucles imbriquées : somme des 9 voisins de chaque pixel</w:t>
-            </w:r>
-          </w:p>
-        </w:tc>
-        <w:tc>
-          <w:tcPr>
-            <w:tcW w:type="dxa" w:w="3638"/>
-            <w:tcBorders>
-              <w:top w:val="single" w:color="BFBFBF" w:sz="4"/>
-              <w:left w:val="single" w:color="BFBFBF" w:sz="4"/>
-              <w:bottom w:val="single" w:color="BFBFBF" w:sz="4"/>
-              <w:right w:val="single" w:color="BFBFBF" w:sz="4"/>
-            </w:tcBorders>
-            <w:shd w:fill="F2F2F2" w:color="auto" w:val="clear"/>
-            <w:tcMar>
-              <w:top w:type="dxa" w:w="70"/>
-              <w:left w:type="dxa" w:w="110"/>
-              <w:bottom w:type="dxa" w:w="70"/>
-              <w:right w:type="dxa" w:w="110"/>
-            </w:tcMar>
-          </w:tcPr>
-          <w:p>
-            <w:pPr>
-              <w:jc w:val="left"/>
-            </w:pPr>
-            <w:r>
-              <w:rPr>
-                <w:rFonts w:ascii="Calibri" w:cs="Calibri" w:eastAsia="Calibri" w:hAnsi="Calibri"/>
-                <w:b w:val="false"/>
-                <w:bCs w:val="false"/>
-                <w:sz w:val="20"/>
-                <w:szCs w:val="20"/>
-              </w:rPr>
-              <w:t xml:space="preserve">Somme de 9 copies décalées de l'image (découpage par tranches), puis division par 9</w:t>
-            </w:r>
-          </w:p>
-        </w:tc>
-      </w:tr>
-      <w:tr>
-        <w:tc>
-          <w:tcPr>
-            <w:tcW w:type="dxa" w:w="2700"/>
-            <w:tcBorders>
-              <w:top w:val="single" w:color="BFBFBF" w:sz="4"/>
-              <w:left w:val="single" w:color="BFBFBF" w:sz="4"/>
-              <w:bottom w:val="single" w:color="BFBFBF" w:sz="4"/>
-              <w:right w:val="single" w:color="BFBFBF" w:sz="4"/>
-            </w:tcBorders>
-            <w:tcMar>
-              <w:top w:type="dxa" w:w="70"/>
-              <w:left w:type="dxa" w:w="110"/>
-              <w:bottom w:type="dxa" w:w="70"/>
-              <w:right w:type="dxa" w:w="110"/>
-            </w:tcMar>
-          </w:tcPr>
-          <w:p>
-            <w:pPr>
-              <w:jc w:val="left"/>
-            </w:pPr>
-            <w:r>
-              <w:rPr>
-                <w:rFonts w:ascii="Calibri" w:cs="Calibri" w:eastAsia="Calibri" w:hAnsi="Calibri"/>
-                <w:b w:val="false"/>
-                <w:bCs w:val="false"/>
-                <w:sz w:val="20"/>
-                <w:szCs w:val="20"/>
-              </w:rPr>
-              <w:t xml:space="preserve">compute_image_statistics</w:t>
-            </w:r>
-          </w:p>
-        </w:tc>
-        <w:tc>
-          <w:tcPr>
-            <w:tcW w:type="dxa" w:w="3300"/>
-            <w:tcBorders>
-              <w:top w:val="single" w:color="BFBFBF" w:sz="4"/>
-              <w:left w:val="single" w:color="BFBFBF" w:sz="4"/>
-              <w:bottom w:val="single" w:color="BFBFBF" w:sz="4"/>
-              <w:right w:val="single" w:color="BFBFBF" w:sz="4"/>
-            </w:tcBorders>
-            <w:tcMar>
-              <w:top w:type="dxa" w:w="70"/>
-              <w:left w:type="dxa" w:w="110"/>
-              <w:bottom w:type="dxa" w:w="70"/>
-              <w:right w:type="dxa" w:w="110"/>
-            </w:tcMar>
-          </w:tcPr>
-          <w:p>
-            <w:pPr>
-              <w:jc w:val="left"/>
-            </w:pPr>
-            <w:r>
-              <w:rPr>
-                <w:rFonts w:ascii="Calibri" w:cs="Calibri" w:eastAsia="Calibri" w:hAnsi="Calibri"/>
-                <w:b w:val="false"/>
-                <w:bCs w:val="false"/>
-                <w:sz w:val="20"/>
-                <w:szCs w:val="20"/>
-              </w:rPr>
-              <w:t xml:space="preserve">Double boucle : somme, maximum, comptage</w:t>
-            </w:r>
-          </w:p>
-        </w:tc>
-        <w:tc>
-          <w:tcPr>
-            <w:tcW w:type="dxa" w:w="3638"/>
-            <w:tcBorders>
-              <w:top w:val="single" w:color="BFBFBF" w:sz="4"/>
-              <w:left w:val="single" w:color="BFBFBF" w:sz="4"/>
-              <w:bottom w:val="single" w:color="BFBFBF" w:sz="4"/>
-              <w:right w:val="single" w:color="BFBFBF" w:sz="4"/>
-            </w:tcBorders>
-            <w:tcMar>
-              <w:top w:type="dxa" w:w="70"/>
-              <w:left w:type="dxa" w:w="110"/>
-              <w:bottom w:type="dxa" w:w="70"/>
-              <w:right w:type="dxa" w:w="110"/>
-            </w:tcMar>
-          </w:tcPr>
-          <w:p>
-            <w:pPr>
-              <w:jc w:val="left"/>
-            </w:pPr>
-            <w:r>
-              <w:rPr>
-                <w:rFonts w:ascii="Calibri" w:cs="Calibri" w:eastAsia="Calibri" w:hAnsi="Calibri"/>
-                <w:b w:val="false"/>
-                <w:bCs w:val="false"/>
-                <w:sz w:val="20"/>
-                <w:szCs w:val="20"/>
-              </w:rPr>
-              <w:t xml:space="preserve">sum(), max() et count_nonzero(image &gt;= seuil)</w:t>
-            </w:r>
-          </w:p>
-        </w:tc>
-      </w:tr>
-    </w:tbl>
-    <w:p>
-      <w:pPr>
-        <w:spacing w:after="60"/>
-      </w:pPr>
+        <w:t xml:space="preserve">threading_version.py</w:t>
+      </w:r>
+      <w:r>
+        <w:rPr>
+          <w:rFonts w:ascii="Calibri" w:cs="Calibri" w:eastAsia="Calibri" w:hAnsi="Calibri"/>
+        </w:rPr>
+        <w:t xml:space="preserve">. Responsable : </w:t>
+      </w:r>
+      <w:r>
+        <w:rPr>
+          <w:rFonts w:ascii="Calibri" w:cs="Calibri" w:eastAsia="Calibri" w:hAnsi="Calibri"/>
+          <w:i/>
+          <w:iCs/>
+          <w:color w:val="7F6000"/>
+          <w:shd w:fill="FFF59D" w:color="auto" w:val="clear"/>
+        </w:rPr>
+        <w:t xml:space="preserve">[À compléter – nom]</w:t>
+      </w:r>
     </w:p>
     <w:tbl>
       <w:tblPr>
@@ -4937,1572 +4125,6 @@
                 <w:bCs/>
                 <w:color w:val="1F3864"/>
               </w:rPr>
-              <w:t xml:space="preserve">Choix technique : garantir des résultats identiques</w:t>
-            </w:r>
-          </w:p>
-          <w:p>
-            <w:pPr>
-              <w:spacing w:after="40"/>
-            </w:pPr>
-            <w:r>
-              <w:rPr>
-                <w:rFonts w:ascii="Calibri" w:cs="Calibri" w:eastAsia="Calibri" w:hAnsi="Calibri"/>
-                <w:sz w:val="20"/>
-                <w:szCs w:val="20"/>
-              </w:rPr>
-              <w:t xml:space="preserve">Dans la version séquentielle, chaque pixel est converti en float64 (float(...)) avant le calcul, puis le résultat est rangé en float32. La version vectorisée fait exactement la même chose (astype(np.float64), calcul, puis astype(np.float32)), et additionne les 9 voisins du filtre dans le même ordre que les boucles. Résultat : les images normalisées et filtrées sont identiques au bit près (vérifié par np.array_equal sur les 24 images).</w:t>
-            </w:r>
-          </w:p>
-        </w:tc>
-      </w:tr>
-    </w:tbl>
-    <w:p>
-      <w:pPr>
-        <w:spacing w:after="60"/>
-      </w:pPr>
-    </w:p>
-    <w:p>
-      <w:pPr>
-        <w:pStyle w:val="Heading2"/>
-      </w:pPr>
-      <w:r>
-        <w:rPr>
-          <w:rFonts w:ascii="Calibri" w:cs="Calibri" w:eastAsia="Calibri" w:hAnsi="Calibri"/>
-        </w:rPr>
-        <w:t xml:space="preserve">3.2 Gain par fonction</w:t>
-      </w:r>
-    </w:p>
-    <w:p>
-      <w:pPr>
-        <w:shd w:fill="F2F2F2" w:color="auto" w:val="clear"/>
-        <w:spacing w:after="0"/>
-        <w:ind w:left="200"/>
-      </w:pPr>
-      <w:r>
-        <w:rPr>
-          <w:rFonts w:ascii="Consolas" w:cs="Consolas" w:eastAsia="Consolas" w:hAnsi="Consolas"/>
-          <w:sz w:val="19"/>
-          <w:szCs w:val="19"/>
-        </w:rPr>
-        <w:t xml:space="preserve">python vectorized_version.py --compare</w:t>
-      </w:r>
-    </w:p>
-    <w:p>
-      <w:pPr>
-        <w:spacing w:after="60"/>
-      </w:pPr>
-    </w:p>
-    <w:p>
-      <w:pPr>
-        <w:spacing w:after="120" w:line="276"/>
-      </w:pPr>
-      <w:r>
-        <w:rPr>
-          <w:rFonts w:ascii="Calibri" w:cs="Calibri" w:eastAsia="Calibri" w:hAnsi="Calibri"/>
-        </w:rPr>
-        <w:t xml:space="preserve">Ce mode vérifie d'abord que chaque étape donne le même résultat dans les deux versions, puis mesure chaque étape sur les 24 images (médiane de 3 exécutions). Résultats sur le PC portable de Loïs :</w:t>
-      </w:r>
-    </w:p>
-    <w:tbl>
-      <w:tblPr>
-        <w:tblW w:type="dxa" w:w="9638"/>
-        <w:tblBorders>
-          <w:top w:val="single" w:color="auto" w:sz="4"/>
-          <w:left w:val="single" w:color="auto" w:sz="4"/>
-          <w:bottom w:val="single" w:color="auto" w:sz="4"/>
-          <w:right w:val="single" w:color="auto" w:sz="4"/>
-          <w:insideH w:val="single" w:color="auto" w:sz="4"/>
-          <w:insideV w:val="single" w:color="auto" w:sz="4"/>
-        </w:tblBorders>
-      </w:tblPr>
-      <w:tblGrid>
-        <w:gridCol w:w="3500"/>
-        <w:gridCol w:w="2050"/>
-        <w:gridCol w:w="2050"/>
-        <w:gridCol w:w="2038"/>
-      </w:tblGrid>
-      <w:tr>
-        <w:trPr>
-          <w:tblHeader/>
-        </w:trPr>
-        <w:tc>
-          <w:tcPr>
-            <w:tcW w:type="dxa" w:w="3500"/>
-            <w:tcBorders>
-              <w:top w:val="single" w:color="BFBFBF" w:sz="4"/>
-              <w:left w:val="single" w:color="BFBFBF" w:sz="4"/>
-              <w:bottom w:val="single" w:color="BFBFBF" w:sz="4"/>
-              <w:right w:val="single" w:color="BFBFBF" w:sz="4"/>
-            </w:tcBorders>
-            <w:shd w:fill="1F3864" w:color="auto" w:val="clear"/>
-            <w:tcMar>
-              <w:top w:type="dxa" w:w="70"/>
-              <w:left w:type="dxa" w:w="110"/>
-              <w:bottom w:type="dxa" w:w="70"/>
-              <w:right w:type="dxa" w:w="110"/>
-            </w:tcMar>
-          </w:tcPr>
-          <w:p>
-            <w:pPr>
-              <w:jc w:val="left"/>
-            </w:pPr>
-            <w:r>
-              <w:rPr>
-                <w:rFonts w:ascii="Calibri" w:cs="Calibri" w:eastAsia="Calibri" w:hAnsi="Calibri"/>
-                <w:b/>
-                <w:bCs/>
-                <w:color w:val="FFFFFF"/>
-                <w:sz w:val="20"/>
-                <w:szCs w:val="20"/>
-              </w:rPr>
-              <w:t xml:space="preserve">Étape</w:t>
-            </w:r>
-          </w:p>
-        </w:tc>
-        <w:tc>
-          <w:tcPr>
-            <w:tcW w:type="dxa" w:w="2050"/>
-            <w:tcBorders>
-              <w:top w:val="single" w:color="BFBFBF" w:sz="4"/>
-              <w:left w:val="single" w:color="BFBFBF" w:sz="4"/>
-              <w:bottom w:val="single" w:color="BFBFBF" w:sz="4"/>
-              <w:right w:val="single" w:color="BFBFBF" w:sz="4"/>
-            </w:tcBorders>
-            <w:shd w:fill="1F3864" w:color="auto" w:val="clear"/>
-            <w:tcMar>
-              <w:top w:type="dxa" w:w="70"/>
-              <w:left w:type="dxa" w:w="110"/>
-              <w:bottom w:type="dxa" w:w="70"/>
-              <w:right w:type="dxa" w:w="110"/>
-            </w:tcMar>
-          </w:tcPr>
-          <w:p>
-            <w:pPr>
-              <w:jc w:val="center"/>
-            </w:pPr>
-            <w:r>
-              <w:rPr>
-                <w:rFonts w:ascii="Calibri" w:cs="Calibri" w:eastAsia="Calibri" w:hAnsi="Calibri"/>
-                <w:b/>
-                <w:bCs/>
-                <w:color w:val="FFFFFF"/>
-                <w:sz w:val="20"/>
-                <w:szCs w:val="20"/>
-              </w:rPr>
-              <w:t xml:space="preserve">Séquentiel (s)</w:t>
-            </w:r>
-          </w:p>
-        </w:tc>
-        <w:tc>
-          <w:tcPr>
-            <w:tcW w:type="dxa" w:w="2050"/>
-            <w:tcBorders>
-              <w:top w:val="single" w:color="BFBFBF" w:sz="4"/>
-              <w:left w:val="single" w:color="BFBFBF" w:sz="4"/>
-              <w:bottom w:val="single" w:color="BFBFBF" w:sz="4"/>
-              <w:right w:val="single" w:color="BFBFBF" w:sz="4"/>
-            </w:tcBorders>
-            <w:shd w:fill="1F3864" w:color="auto" w:val="clear"/>
-            <w:tcMar>
-              <w:top w:type="dxa" w:w="70"/>
-              <w:left w:type="dxa" w:w="110"/>
-              <w:bottom w:type="dxa" w:w="70"/>
-              <w:right w:type="dxa" w:w="110"/>
-            </w:tcMar>
-          </w:tcPr>
-          <w:p>
-            <w:pPr>
-              <w:jc w:val="center"/>
-            </w:pPr>
-            <w:r>
-              <w:rPr>
-                <w:rFonts w:ascii="Calibri" w:cs="Calibri" w:eastAsia="Calibri" w:hAnsi="Calibri"/>
-                <w:b/>
-                <w:bCs/>
-                <w:color w:val="FFFFFF"/>
-                <w:sz w:val="20"/>
-                <w:szCs w:val="20"/>
-              </w:rPr>
-              <w:t xml:space="preserve">Vectorisé (s)</w:t>
-            </w:r>
-          </w:p>
-        </w:tc>
-        <w:tc>
-          <w:tcPr>
-            <w:tcW w:type="dxa" w:w="2038"/>
-            <w:tcBorders>
-              <w:top w:val="single" w:color="BFBFBF" w:sz="4"/>
-              <w:left w:val="single" w:color="BFBFBF" w:sz="4"/>
-              <w:bottom w:val="single" w:color="BFBFBF" w:sz="4"/>
-              <w:right w:val="single" w:color="BFBFBF" w:sz="4"/>
-            </w:tcBorders>
-            <w:shd w:fill="1F3864" w:color="auto" w:val="clear"/>
-            <w:tcMar>
-              <w:top w:type="dxa" w:w="70"/>
-              <w:left w:type="dxa" w:w="110"/>
-              <w:bottom w:type="dxa" w:w="70"/>
-              <w:right w:type="dxa" w:w="110"/>
-            </w:tcMar>
-          </w:tcPr>
-          <w:p>
-            <w:pPr>
-              <w:jc w:val="center"/>
-            </w:pPr>
-            <w:r>
-              <w:rPr>
-                <w:rFonts w:ascii="Calibri" w:cs="Calibri" w:eastAsia="Calibri" w:hAnsi="Calibri"/>
-                <w:b/>
-                <w:bCs/>
-                <w:color w:val="FFFFFF"/>
-                <w:sz w:val="20"/>
-                <w:szCs w:val="20"/>
-              </w:rPr>
-              <w:t xml:space="preserve">Speedup</w:t>
-            </w:r>
-          </w:p>
-        </w:tc>
-      </w:tr>
-      <w:tr>
-        <w:tc>
-          <w:tcPr>
-            <w:tcW w:type="dxa" w:w="3500"/>
-            <w:tcBorders>
-              <w:top w:val="single" w:color="BFBFBF" w:sz="4"/>
-              <w:left w:val="single" w:color="BFBFBF" w:sz="4"/>
-              <w:bottom w:val="single" w:color="BFBFBF" w:sz="4"/>
-              <w:right w:val="single" w:color="BFBFBF" w:sz="4"/>
-            </w:tcBorders>
-            <w:tcMar>
-              <w:top w:type="dxa" w:w="70"/>
-              <w:left w:type="dxa" w:w="110"/>
-              <w:bottom w:type="dxa" w:w="70"/>
-              <w:right w:type="dxa" w:w="110"/>
-            </w:tcMar>
-          </w:tcPr>
-          <w:p>
-            <w:pPr>
-              <w:jc w:val="left"/>
-            </w:pPr>
-            <w:r>
-              <w:rPr>
-                <w:rFonts w:ascii="Calibri" w:cs="Calibri" w:eastAsia="Calibri" w:hAnsi="Calibri"/>
-                <w:b w:val="false"/>
-                <w:bCs w:val="false"/>
-                <w:sz w:val="20"/>
-                <w:szCs w:val="20"/>
-              </w:rPr>
-              <w:t xml:space="preserve">normalize_image</w:t>
-            </w:r>
-          </w:p>
-        </w:tc>
-        <w:tc>
-          <w:tcPr>
-            <w:tcW w:type="dxa" w:w="2050"/>
-            <w:tcBorders>
-              <w:top w:val="single" w:color="BFBFBF" w:sz="4"/>
-              <w:left w:val="single" w:color="BFBFBF" w:sz="4"/>
-              <w:bottom w:val="single" w:color="BFBFBF" w:sz="4"/>
-              <w:right w:val="single" w:color="BFBFBF" w:sz="4"/>
-            </w:tcBorders>
-            <w:tcMar>
-              <w:top w:type="dxa" w:w="70"/>
-              <w:left w:type="dxa" w:w="110"/>
-              <w:bottom w:type="dxa" w:w="70"/>
-              <w:right w:type="dxa" w:w="110"/>
-            </w:tcMar>
-          </w:tcPr>
-          <w:p>
-            <w:pPr>
-              <w:jc w:val="center"/>
-            </w:pPr>
-            <w:r>
-              <w:rPr>
-                <w:rFonts w:ascii="Calibri" w:cs="Calibri" w:eastAsia="Calibri" w:hAnsi="Calibri"/>
-                <w:b w:val="false"/>
-                <w:bCs w:val="false"/>
-                <w:sz w:val="20"/>
-                <w:szCs w:val="20"/>
-              </w:rPr>
-              <w:t xml:space="preserve">0,3513</w:t>
-            </w:r>
-          </w:p>
-        </w:tc>
-        <w:tc>
-          <w:tcPr>
-            <w:tcW w:type="dxa" w:w="2050"/>
-            <w:tcBorders>
-              <w:top w:val="single" w:color="BFBFBF" w:sz="4"/>
-              <w:left w:val="single" w:color="BFBFBF" w:sz="4"/>
-              <w:bottom w:val="single" w:color="BFBFBF" w:sz="4"/>
-              <w:right w:val="single" w:color="BFBFBF" w:sz="4"/>
-            </w:tcBorders>
-            <w:tcMar>
-              <w:top w:type="dxa" w:w="70"/>
-              <w:left w:type="dxa" w:w="110"/>
-              <w:bottom w:type="dxa" w:w="70"/>
-              <w:right w:type="dxa" w:w="110"/>
-            </w:tcMar>
-          </w:tcPr>
-          <w:p>
-            <w:pPr>
-              <w:jc w:val="center"/>
-            </w:pPr>
-            <w:r>
-              <w:rPr>
-                <w:rFonts w:ascii="Calibri" w:cs="Calibri" w:eastAsia="Calibri" w:hAnsi="Calibri"/>
-                <w:b w:val="false"/>
-                <w:bCs w:val="false"/>
-                <w:sz w:val="20"/>
-                <w:szCs w:val="20"/>
-              </w:rPr>
-              <w:t xml:space="preserve">0,00274</w:t>
-            </w:r>
-          </w:p>
-        </w:tc>
-        <w:tc>
-          <w:tcPr>
-            <w:tcW w:type="dxa" w:w="2038"/>
-            <w:tcBorders>
-              <w:top w:val="single" w:color="BFBFBF" w:sz="4"/>
-              <w:left w:val="single" w:color="BFBFBF" w:sz="4"/>
-              <w:bottom w:val="single" w:color="BFBFBF" w:sz="4"/>
-              <w:right w:val="single" w:color="BFBFBF" w:sz="4"/>
-            </w:tcBorders>
-            <w:tcMar>
-              <w:top w:type="dxa" w:w="70"/>
-              <w:left w:type="dxa" w:w="110"/>
-              <w:bottom w:type="dxa" w:w="70"/>
-              <w:right w:type="dxa" w:w="110"/>
-            </w:tcMar>
-          </w:tcPr>
-          <w:p>
-            <w:pPr>
-              <w:jc w:val="center"/>
-            </w:pPr>
-            <w:r>
-              <w:rPr>
-                <w:rFonts w:ascii="Calibri" w:cs="Calibri" w:eastAsia="Calibri" w:hAnsi="Calibri"/>
-                <w:b w:val="false"/>
-                <w:bCs w:val="false"/>
-                <w:sz w:val="20"/>
-                <w:szCs w:val="20"/>
-              </w:rPr>
-              <w:t xml:space="preserve">× 128</w:t>
-            </w:r>
-          </w:p>
-        </w:tc>
-      </w:tr>
-      <w:tr>
-        <w:tc>
-          <w:tcPr>
-            <w:tcW w:type="dxa" w:w="3500"/>
-            <w:tcBorders>
-              <w:top w:val="single" w:color="BFBFBF" w:sz="4"/>
-              <w:left w:val="single" w:color="BFBFBF" w:sz="4"/>
-              <w:bottom w:val="single" w:color="BFBFBF" w:sz="4"/>
-              <w:right w:val="single" w:color="BFBFBF" w:sz="4"/>
-            </w:tcBorders>
-            <w:shd w:fill="F2F2F2" w:color="auto" w:val="clear"/>
-            <w:tcMar>
-              <w:top w:type="dxa" w:w="70"/>
-              <w:left w:type="dxa" w:w="110"/>
-              <w:bottom w:type="dxa" w:w="70"/>
-              <w:right w:type="dxa" w:w="110"/>
-            </w:tcMar>
-          </w:tcPr>
-          <w:p>
-            <w:pPr>
-              <w:jc w:val="left"/>
-            </w:pPr>
-            <w:r>
-              <w:rPr>
-                <w:rFonts w:ascii="Calibri" w:cs="Calibri" w:eastAsia="Calibri" w:hAnsi="Calibri"/>
-                <w:b w:val="false"/>
-                <w:bCs w:val="false"/>
-                <w:sz w:val="20"/>
-                <w:szCs w:val="20"/>
-              </w:rPr>
-              <w:t xml:space="preserve">mean_filter_3x3</w:t>
-            </w:r>
-          </w:p>
-        </w:tc>
-        <w:tc>
-          <w:tcPr>
-            <w:tcW w:type="dxa" w:w="2050"/>
-            <w:tcBorders>
-              <w:top w:val="single" w:color="BFBFBF" w:sz="4"/>
-              <w:left w:val="single" w:color="BFBFBF" w:sz="4"/>
-              <w:bottom w:val="single" w:color="BFBFBF" w:sz="4"/>
-              <w:right w:val="single" w:color="BFBFBF" w:sz="4"/>
-            </w:tcBorders>
-            <w:shd w:fill="F2F2F2" w:color="auto" w:val="clear"/>
-            <w:tcMar>
-              <w:top w:type="dxa" w:w="70"/>
-              <w:left w:type="dxa" w:w="110"/>
-              <w:bottom w:type="dxa" w:w="70"/>
-              <w:right w:type="dxa" w:w="110"/>
-            </w:tcMar>
-          </w:tcPr>
-          <w:p>
-            <w:pPr>
-              <w:jc w:val="center"/>
-            </w:pPr>
-            <w:r>
-              <w:rPr>
-                <w:rFonts w:ascii="Calibri" w:cs="Calibri" w:eastAsia="Calibri" w:hAnsi="Calibri"/>
-                <w:b w:val="false"/>
-                <w:bCs w:val="false"/>
-                <w:sz w:val="20"/>
-                <w:szCs w:val="20"/>
-              </w:rPr>
-              <w:t xml:space="preserve">2,4989</w:t>
-            </w:r>
-          </w:p>
-        </w:tc>
-        <w:tc>
-          <w:tcPr>
-            <w:tcW w:type="dxa" w:w="2050"/>
-            <w:tcBorders>
-              <w:top w:val="single" w:color="BFBFBF" w:sz="4"/>
-              <w:left w:val="single" w:color="BFBFBF" w:sz="4"/>
-              <w:bottom w:val="single" w:color="BFBFBF" w:sz="4"/>
-              <w:right w:val="single" w:color="BFBFBF" w:sz="4"/>
-            </w:tcBorders>
-            <w:shd w:fill="F2F2F2" w:color="auto" w:val="clear"/>
-            <w:tcMar>
-              <w:top w:type="dxa" w:w="70"/>
-              <w:left w:type="dxa" w:w="110"/>
-              <w:bottom w:type="dxa" w:w="70"/>
-              <w:right w:type="dxa" w:w="110"/>
-            </w:tcMar>
-          </w:tcPr>
-          <w:p>
-            <w:pPr>
-              <w:jc w:val="center"/>
-            </w:pPr>
-            <w:r>
-              <w:rPr>
-                <w:rFonts w:ascii="Calibri" w:cs="Calibri" w:eastAsia="Calibri" w:hAnsi="Calibri"/>
-                <w:b w:val="false"/>
-                <w:bCs w:val="false"/>
-                <w:sz w:val="20"/>
-                <w:szCs w:val="20"/>
-              </w:rPr>
-              <w:t xml:space="preserve">0,01455</w:t>
-            </w:r>
-          </w:p>
-        </w:tc>
-        <w:tc>
-          <w:tcPr>
-            <w:tcW w:type="dxa" w:w="2038"/>
-            <w:tcBorders>
-              <w:top w:val="single" w:color="BFBFBF" w:sz="4"/>
-              <w:left w:val="single" w:color="BFBFBF" w:sz="4"/>
-              <w:bottom w:val="single" w:color="BFBFBF" w:sz="4"/>
-              <w:right w:val="single" w:color="BFBFBF" w:sz="4"/>
-            </w:tcBorders>
-            <w:shd w:fill="F2F2F2" w:color="auto" w:val="clear"/>
-            <w:tcMar>
-              <w:top w:type="dxa" w:w="70"/>
-              <w:left w:type="dxa" w:w="110"/>
-              <w:bottom w:type="dxa" w:w="70"/>
-              <w:right w:type="dxa" w:w="110"/>
-            </w:tcMar>
-          </w:tcPr>
-          <w:p>
-            <w:pPr>
-              <w:jc w:val="center"/>
-            </w:pPr>
-            <w:r>
-              <w:rPr>
-                <w:rFonts w:ascii="Calibri" w:cs="Calibri" w:eastAsia="Calibri" w:hAnsi="Calibri"/>
-                <w:b w:val="false"/>
-                <w:bCs w:val="false"/>
-                <w:sz w:val="20"/>
-                <w:szCs w:val="20"/>
-              </w:rPr>
-              <w:t xml:space="preserve">× 172</w:t>
-            </w:r>
-          </w:p>
-        </w:tc>
-      </w:tr>
-      <w:tr>
-        <w:tc>
-          <w:tcPr>
-            <w:tcW w:type="dxa" w:w="3500"/>
-            <w:tcBorders>
-              <w:top w:val="single" w:color="BFBFBF" w:sz="4"/>
-              <w:left w:val="single" w:color="BFBFBF" w:sz="4"/>
-              <w:bottom w:val="single" w:color="BFBFBF" w:sz="4"/>
-              <w:right w:val="single" w:color="BFBFBF" w:sz="4"/>
-            </w:tcBorders>
-            <w:tcMar>
-              <w:top w:type="dxa" w:w="70"/>
-              <w:left w:type="dxa" w:w="110"/>
-              <w:bottom w:type="dxa" w:w="70"/>
-              <w:right w:type="dxa" w:w="110"/>
-            </w:tcMar>
-          </w:tcPr>
-          <w:p>
-            <w:pPr>
-              <w:jc w:val="left"/>
-            </w:pPr>
-            <w:r>
-              <w:rPr>
-                <w:rFonts w:ascii="Calibri" w:cs="Calibri" w:eastAsia="Calibri" w:hAnsi="Calibri"/>
-                <w:b w:val="false"/>
-                <w:bCs w:val="false"/>
-                <w:sz w:val="20"/>
-                <w:szCs w:val="20"/>
-              </w:rPr>
-              <w:t xml:space="preserve">compute_image_statistics</w:t>
-            </w:r>
-          </w:p>
-        </w:tc>
-        <w:tc>
-          <w:tcPr>
-            <w:tcW w:type="dxa" w:w="2050"/>
-            <w:tcBorders>
-              <w:top w:val="single" w:color="BFBFBF" w:sz="4"/>
-              <w:left w:val="single" w:color="BFBFBF" w:sz="4"/>
-              <w:bottom w:val="single" w:color="BFBFBF" w:sz="4"/>
-              <w:right w:val="single" w:color="BFBFBF" w:sz="4"/>
-            </w:tcBorders>
-            <w:tcMar>
-              <w:top w:type="dxa" w:w="70"/>
-              <w:left w:type="dxa" w:w="110"/>
-              <w:bottom w:type="dxa" w:w="70"/>
-              <w:right w:type="dxa" w:w="110"/>
-            </w:tcMar>
-          </w:tcPr>
-          <w:p>
-            <w:pPr>
-              <w:jc w:val="center"/>
-            </w:pPr>
-            <w:r>
-              <w:rPr>
-                <w:rFonts w:ascii="Calibri" w:cs="Calibri" w:eastAsia="Calibri" w:hAnsi="Calibri"/>
-                <w:b w:val="false"/>
-                <w:bCs w:val="false"/>
-                <w:sz w:val="20"/>
-                <w:szCs w:val="20"/>
-              </w:rPr>
-              <w:t xml:space="preserve">0,2077</w:t>
-            </w:r>
-          </w:p>
-        </w:tc>
-        <w:tc>
-          <w:tcPr>
-            <w:tcW w:type="dxa" w:w="2050"/>
-            <w:tcBorders>
-              <w:top w:val="single" w:color="BFBFBF" w:sz="4"/>
-              <w:left w:val="single" w:color="BFBFBF" w:sz="4"/>
-              <w:bottom w:val="single" w:color="BFBFBF" w:sz="4"/>
-              <w:right w:val="single" w:color="BFBFBF" w:sz="4"/>
-            </w:tcBorders>
-            <w:tcMar>
-              <w:top w:type="dxa" w:w="70"/>
-              <w:left w:type="dxa" w:w="110"/>
-              <w:bottom w:type="dxa" w:w="70"/>
-              <w:right w:type="dxa" w:w="110"/>
-            </w:tcMar>
-          </w:tcPr>
-          <w:p>
-            <w:pPr>
-              <w:jc w:val="center"/>
-            </w:pPr>
-            <w:r>
-              <w:rPr>
-                <w:rFonts w:ascii="Calibri" w:cs="Calibri" w:eastAsia="Calibri" w:hAnsi="Calibri"/>
-                <w:b w:val="false"/>
-                <w:bCs w:val="false"/>
-                <w:sz w:val="20"/>
-                <w:szCs w:val="20"/>
-              </w:rPr>
-              <w:t xml:space="preserve">0,00146</w:t>
-            </w:r>
-          </w:p>
-        </w:tc>
-        <w:tc>
-          <w:tcPr>
-            <w:tcW w:type="dxa" w:w="2038"/>
-            <w:tcBorders>
-              <w:top w:val="single" w:color="BFBFBF" w:sz="4"/>
-              <w:left w:val="single" w:color="BFBFBF" w:sz="4"/>
-              <w:bottom w:val="single" w:color="BFBFBF" w:sz="4"/>
-              <w:right w:val="single" w:color="BFBFBF" w:sz="4"/>
-            </w:tcBorders>
-            <w:tcMar>
-              <w:top w:type="dxa" w:w="70"/>
-              <w:left w:type="dxa" w:w="110"/>
-              <w:bottom w:type="dxa" w:w="70"/>
-              <w:right w:type="dxa" w:w="110"/>
-            </w:tcMar>
-          </w:tcPr>
-          <w:p>
-            <w:pPr>
-              <w:jc w:val="center"/>
-            </w:pPr>
-            <w:r>
-              <w:rPr>
-                <w:rFonts w:ascii="Calibri" w:cs="Calibri" w:eastAsia="Calibri" w:hAnsi="Calibri"/>
-                <w:b w:val="false"/>
-                <w:bCs w:val="false"/>
-                <w:sz w:val="20"/>
-                <w:szCs w:val="20"/>
-              </w:rPr>
-              <w:t xml:space="preserve">× 143</w:t>
-            </w:r>
-          </w:p>
-        </w:tc>
-      </w:tr>
-      <w:tr>
-        <w:tc>
-          <w:tcPr>
-            <w:tcW w:type="dxa" w:w="3500"/>
-            <w:tcBorders>
-              <w:top w:val="single" w:color="BFBFBF" w:sz="4"/>
-              <w:left w:val="single" w:color="BFBFBF" w:sz="4"/>
-              <w:bottom w:val="single" w:color="BFBFBF" w:sz="4"/>
-              <w:right w:val="single" w:color="BFBFBF" w:sz="4"/>
-            </w:tcBorders>
-            <w:shd w:fill="F2F2F2" w:color="auto" w:val="clear"/>
-            <w:tcMar>
-              <w:top w:type="dxa" w:w="70"/>
-              <w:left w:type="dxa" w:w="110"/>
-              <w:bottom w:type="dxa" w:w="70"/>
-              <w:right w:type="dxa" w:w="110"/>
-            </w:tcMar>
-          </w:tcPr>
-          <w:p>
-            <w:pPr>
-              <w:jc w:val="left"/>
-            </w:pPr>
-            <w:r>
-              <w:rPr>
-                <w:rFonts w:ascii="Calibri" w:cs="Calibri" w:eastAsia="Calibri" w:hAnsi="Calibri"/>
-                <w:b/>
-                <w:bCs/>
-              </w:rPr>
-              <w:t xml:space="preserve">Total des 3 étapes</w:t>
-            </w:r>
-          </w:p>
-        </w:tc>
-        <w:tc>
-          <w:tcPr>
-            <w:tcW w:type="dxa" w:w="2050"/>
-            <w:tcBorders>
-              <w:top w:val="single" w:color="BFBFBF" w:sz="4"/>
-              <w:left w:val="single" w:color="BFBFBF" w:sz="4"/>
-              <w:bottom w:val="single" w:color="BFBFBF" w:sz="4"/>
-              <w:right w:val="single" w:color="BFBFBF" w:sz="4"/>
-            </w:tcBorders>
-            <w:shd w:fill="F2F2F2" w:color="auto" w:val="clear"/>
-            <w:tcMar>
-              <w:top w:type="dxa" w:w="70"/>
-              <w:left w:type="dxa" w:w="110"/>
-              <w:bottom w:type="dxa" w:w="70"/>
-              <w:right w:type="dxa" w:w="110"/>
-            </w:tcMar>
-          </w:tcPr>
-          <w:p>
-            <w:pPr>
-              <w:jc w:val="center"/>
-            </w:pPr>
-            <w:r>
-              <w:rPr>
-                <w:rFonts w:ascii="Calibri" w:cs="Calibri" w:eastAsia="Calibri" w:hAnsi="Calibri"/>
-                <w:b/>
-                <w:bCs/>
-              </w:rPr>
-              <w:t xml:space="preserve">3,0579</w:t>
-            </w:r>
-          </w:p>
-        </w:tc>
-        <w:tc>
-          <w:tcPr>
-            <w:tcW w:type="dxa" w:w="2050"/>
-            <w:tcBorders>
-              <w:top w:val="single" w:color="BFBFBF" w:sz="4"/>
-              <w:left w:val="single" w:color="BFBFBF" w:sz="4"/>
-              <w:bottom w:val="single" w:color="BFBFBF" w:sz="4"/>
-              <w:right w:val="single" w:color="BFBFBF" w:sz="4"/>
-            </w:tcBorders>
-            <w:shd w:fill="F2F2F2" w:color="auto" w:val="clear"/>
-            <w:tcMar>
-              <w:top w:type="dxa" w:w="70"/>
-              <w:left w:type="dxa" w:w="110"/>
-              <w:bottom w:type="dxa" w:w="70"/>
-              <w:right w:type="dxa" w:w="110"/>
-            </w:tcMar>
-          </w:tcPr>
-          <w:p>
-            <w:pPr>
-              <w:jc w:val="center"/>
-            </w:pPr>
-            <w:r>
-              <w:rPr>
-                <w:rFonts w:ascii="Calibri" w:cs="Calibri" w:eastAsia="Calibri" w:hAnsi="Calibri"/>
-                <w:b/>
-                <w:bCs/>
-              </w:rPr>
-              <w:t xml:space="preserve">0,01874</w:t>
-            </w:r>
-          </w:p>
-        </w:tc>
-        <w:tc>
-          <w:tcPr>
-            <w:tcW w:type="dxa" w:w="2038"/>
-            <w:tcBorders>
-              <w:top w:val="single" w:color="BFBFBF" w:sz="4"/>
-              <w:left w:val="single" w:color="BFBFBF" w:sz="4"/>
-              <w:bottom w:val="single" w:color="BFBFBF" w:sz="4"/>
-              <w:right w:val="single" w:color="BFBFBF" w:sz="4"/>
-            </w:tcBorders>
-            <w:shd w:fill="F2F2F2" w:color="auto" w:val="clear"/>
-            <w:tcMar>
-              <w:top w:type="dxa" w:w="70"/>
-              <w:left w:type="dxa" w:w="110"/>
-              <w:bottom w:type="dxa" w:w="70"/>
-              <w:right w:type="dxa" w:w="110"/>
-            </w:tcMar>
-          </w:tcPr>
-          <w:p>
-            <w:pPr>
-              <w:jc w:val="center"/>
-            </w:pPr>
-            <w:r>
-              <w:rPr>
-                <w:rFonts w:ascii="Calibri" w:cs="Calibri" w:eastAsia="Calibri" w:hAnsi="Calibri"/>
-                <w:b/>
-                <w:bCs/>
-              </w:rPr>
-              <w:t xml:space="preserve">× 163</w:t>
-            </w:r>
-          </w:p>
-        </w:tc>
-      </w:tr>
-    </w:tbl>
-    <w:p>
-      <w:pPr>
-        <w:spacing w:after="60"/>
-      </w:pPr>
-    </w:p>
-    <w:p>
-      <w:pPr>
-        <w:spacing w:after="120" w:line="276"/>
-      </w:pPr>
-      <w:r>
-        <w:rPr>
-          <w:rFonts w:ascii="Calibri" w:cs="Calibri" w:eastAsia="Calibri" w:hAnsi="Calibri"/>
-        </w:rPr>
-        <w:t xml:space="preserve">Vérification de correction : OK sur les 24 images, pour les trois étapes.</w:t>
-      </w:r>
-    </w:p>
-    <w:p>
-      <w:pPr>
-        <w:pStyle w:val="Heading2"/>
-      </w:pPr>
-      <w:r>
-        <w:rPr>
-          <w:rFonts w:ascii="Calibri" w:cs="Calibri" w:eastAsia="Calibri" w:hAnsi="Calibri"/>
-        </w:rPr>
-        <w:t xml:space="preserve">3.3 Pipeline complet</w:t>
-      </w:r>
-    </w:p>
-    <w:p>
-      <w:pPr>
-        <w:shd w:fill="F2F2F2" w:color="auto" w:val="clear"/>
-        <w:spacing w:after="0"/>
-        <w:ind w:left="200"/>
-      </w:pPr>
-      <w:r>
-        <w:rPr>
-          <w:rFonts w:ascii="Consolas" w:cs="Consolas" w:eastAsia="Consolas" w:hAnsi="Consolas"/>
-          <w:sz w:val="19"/>
-          <w:szCs w:val="19"/>
-        </w:rPr>
-        <w:t xml:space="preserve">python vectorized_version.py</w:t>
-      </w:r>
-    </w:p>
-    <w:p>
-      <w:pPr>
-        <w:spacing w:after="60"/>
-      </w:pPr>
-    </w:p>
-    <w:tbl>
-      <w:tblPr>
-        <w:tblW w:type="dxa" w:w="9638"/>
-        <w:tblBorders>
-          <w:top w:val="single" w:color="auto" w:sz="4"/>
-          <w:left w:val="single" w:color="auto" w:sz="4"/>
-          <w:bottom w:val="single" w:color="auto" w:sz="4"/>
-          <w:right w:val="single" w:color="auto" w:sz="4"/>
-          <w:insideH w:val="single" w:color="auto" w:sz="4"/>
-          <w:insideV w:val="single" w:color="auto" w:sz="4"/>
-        </w:tblBorders>
-      </w:tblPr>
-      <w:tblGrid>
-        <w:gridCol w:w="3200"/>
-        <w:gridCol w:w="3200"/>
-        <w:gridCol w:w="3238"/>
-      </w:tblGrid>
-      <w:tr>
-        <w:trPr>
-          <w:tblHeader/>
-        </w:trPr>
-        <w:tc>
-          <w:tcPr>
-            <w:tcW w:type="dxa" w:w="3200"/>
-            <w:tcBorders>
-              <w:top w:val="single" w:color="BFBFBF" w:sz="4"/>
-              <w:left w:val="single" w:color="BFBFBF" w:sz="4"/>
-              <w:bottom w:val="single" w:color="BFBFBF" w:sz="4"/>
-              <w:right w:val="single" w:color="BFBFBF" w:sz="4"/>
-            </w:tcBorders>
-            <w:shd w:fill="1F3864" w:color="auto" w:val="clear"/>
-            <w:tcMar>
-              <w:top w:type="dxa" w:w="70"/>
-              <w:left w:type="dxa" w:w="110"/>
-              <w:bottom w:type="dxa" w:w="70"/>
-              <w:right w:type="dxa" w:w="110"/>
-            </w:tcMar>
-          </w:tcPr>
-          <w:p>
-            <w:pPr>
-              <w:jc w:val="center"/>
-            </w:pPr>
-            <w:r>
-              <w:rPr>
-                <w:rFonts w:ascii="Calibri" w:cs="Calibri" w:eastAsia="Calibri" w:hAnsi="Calibri"/>
-                <w:b/>
-                <w:bCs/>
-                <w:color w:val="FFFFFF"/>
-                <w:sz w:val="20"/>
-                <w:szCs w:val="20"/>
-              </w:rPr>
-              <w:t xml:space="preserve">Exécution</w:t>
-            </w:r>
-          </w:p>
-        </w:tc>
-        <w:tc>
-          <w:tcPr>
-            <w:tcW w:type="dxa" w:w="3200"/>
-            <w:tcBorders>
-              <w:top w:val="single" w:color="BFBFBF" w:sz="4"/>
-              <w:left w:val="single" w:color="BFBFBF" w:sz="4"/>
-              <w:bottom w:val="single" w:color="BFBFBF" w:sz="4"/>
-              <w:right w:val="single" w:color="BFBFBF" w:sz="4"/>
-            </w:tcBorders>
-            <w:shd w:fill="1F3864" w:color="auto" w:val="clear"/>
-            <w:tcMar>
-              <w:top w:type="dxa" w:w="70"/>
-              <w:left w:type="dxa" w:w="110"/>
-              <w:bottom w:type="dxa" w:w="70"/>
-              <w:right w:type="dxa" w:w="110"/>
-            </w:tcMar>
-          </w:tcPr>
-          <w:p>
-            <w:pPr>
-              <w:jc w:val="center"/>
-            </w:pPr>
-            <w:r>
-              <w:rPr>
-                <w:rFonts w:ascii="Calibri" w:cs="Calibri" w:eastAsia="Calibri" w:hAnsi="Calibri"/>
-                <w:b/>
-                <w:bCs/>
-                <w:color w:val="FFFFFF"/>
-                <w:sz w:val="20"/>
-                <w:szCs w:val="20"/>
-              </w:rPr>
-              <w:t xml:space="preserve">Temps (s)</w:t>
-            </w:r>
-          </w:p>
-        </w:tc>
-        <w:tc>
-          <w:tcPr>
-            <w:tcW w:type="dxa" w:w="3238"/>
-            <w:tcBorders>
-              <w:top w:val="single" w:color="BFBFBF" w:sz="4"/>
-              <w:left w:val="single" w:color="BFBFBF" w:sz="4"/>
-              <w:bottom w:val="single" w:color="BFBFBF" w:sz="4"/>
-              <w:right w:val="single" w:color="BFBFBF" w:sz="4"/>
-            </w:tcBorders>
-            <w:shd w:fill="1F3864" w:color="auto" w:val="clear"/>
-            <w:tcMar>
-              <w:top w:type="dxa" w:w="70"/>
-              <w:left w:type="dxa" w:w="110"/>
-              <w:bottom w:type="dxa" w:w="70"/>
-              <w:right w:type="dxa" w:w="110"/>
-            </w:tcMar>
-          </w:tcPr>
-          <w:p>
-            <w:pPr>
-              <w:jc w:val="center"/>
-            </w:pPr>
-            <w:r>
-              <w:rPr>
-                <w:rFonts w:ascii="Calibri" w:cs="Calibri" w:eastAsia="Calibri" w:hAnsi="Calibri"/>
-                <w:b/>
-                <w:bCs/>
-                <w:color w:val="FFFFFF"/>
-                <w:sz w:val="20"/>
-                <w:szCs w:val="20"/>
-              </w:rPr>
-              <w:t xml:space="preserve">Résumé global</w:t>
-            </w:r>
-          </w:p>
-        </w:tc>
-      </w:tr>
-      <w:tr>
-        <w:tc>
-          <w:tcPr>
-            <w:tcW w:type="dxa" w:w="3200"/>
-            <w:tcBorders>
-              <w:top w:val="single" w:color="BFBFBF" w:sz="4"/>
-              <w:left w:val="single" w:color="BFBFBF" w:sz="4"/>
-              <w:bottom w:val="single" w:color="BFBFBF" w:sz="4"/>
-              <w:right w:val="single" w:color="BFBFBF" w:sz="4"/>
-            </w:tcBorders>
-            <w:tcMar>
-              <w:top w:type="dxa" w:w="70"/>
-              <w:left w:type="dxa" w:w="110"/>
-              <w:bottom w:type="dxa" w:w="70"/>
-              <w:right w:type="dxa" w:w="110"/>
-            </w:tcMar>
-          </w:tcPr>
-          <w:p>
-            <w:pPr>
-              <w:jc w:val="center"/>
-            </w:pPr>
-            <w:r>
-              <w:rPr>
-                <w:rFonts w:ascii="Calibri" w:cs="Calibri" w:eastAsia="Calibri" w:hAnsi="Calibri"/>
-                <w:b w:val="false"/>
-                <w:bCs w:val="false"/>
-                <w:sz w:val="20"/>
-                <w:szCs w:val="20"/>
-              </w:rPr>
-              <w:t xml:space="preserve">1</w:t>
-            </w:r>
-          </w:p>
-        </w:tc>
-        <w:tc>
-          <w:tcPr>
-            <w:tcW w:type="dxa" w:w="3200"/>
-            <w:tcBorders>
-              <w:top w:val="single" w:color="BFBFBF" w:sz="4"/>
-              <w:left w:val="single" w:color="BFBFBF" w:sz="4"/>
-              <w:bottom w:val="single" w:color="BFBFBF" w:sz="4"/>
-              <w:right w:val="single" w:color="BFBFBF" w:sz="4"/>
-            </w:tcBorders>
-            <w:tcMar>
-              <w:top w:type="dxa" w:w="70"/>
-              <w:left w:type="dxa" w:w="110"/>
-              <w:bottom w:type="dxa" w:w="70"/>
-              <w:right w:type="dxa" w:w="110"/>
-            </w:tcMar>
-          </w:tcPr>
-          <w:p>
-            <w:pPr>
-              <w:jc w:val="center"/>
-            </w:pPr>
-            <w:r>
-              <w:rPr>
-                <w:rFonts w:ascii="Calibri" w:cs="Calibri" w:eastAsia="Calibri" w:hAnsi="Calibri"/>
-                <w:b w:val="false"/>
-                <w:bCs w:val="false"/>
-                <w:sz w:val="20"/>
-                <w:szCs w:val="20"/>
-              </w:rPr>
-              <w:t xml:space="preserve">0,0395</w:t>
-            </w:r>
-          </w:p>
-        </w:tc>
-        <w:tc>
-          <w:tcPr>
-            <w:tcW w:type="dxa" w:w="3238"/>
-            <w:tcBorders>
-              <w:top w:val="single" w:color="BFBFBF" w:sz="4"/>
-              <w:left w:val="single" w:color="BFBFBF" w:sz="4"/>
-              <w:bottom w:val="single" w:color="BFBFBF" w:sz="4"/>
-              <w:right w:val="single" w:color="BFBFBF" w:sz="4"/>
-            </w:tcBorders>
-            <w:tcMar>
-              <w:top w:type="dxa" w:w="70"/>
-              <w:left w:type="dxa" w:w="110"/>
-              <w:bottom w:type="dxa" w:w="70"/>
-              <w:right w:type="dxa" w:w="110"/>
-            </w:tcMar>
-          </w:tcPr>
-          <w:p>
-            <w:pPr>
-              <w:jc w:val="center"/>
-            </w:pPr>
-            <w:r>
-              <w:rPr>
-                <w:rFonts w:ascii="Calibri" w:cs="Calibri" w:eastAsia="Calibri" w:hAnsi="Calibri"/>
-                <w:b w:val="false"/>
-                <w:bCs w:val="false"/>
-                <w:sz w:val="20"/>
-                <w:szCs w:val="20"/>
-              </w:rPr>
-              <w:t xml:space="preserve">identique à la référence</w:t>
-            </w:r>
-          </w:p>
-        </w:tc>
-      </w:tr>
-      <w:tr>
-        <w:tc>
-          <w:tcPr>
-            <w:tcW w:type="dxa" w:w="3200"/>
-            <w:tcBorders>
-              <w:top w:val="single" w:color="BFBFBF" w:sz="4"/>
-              <w:left w:val="single" w:color="BFBFBF" w:sz="4"/>
-              <w:bottom w:val="single" w:color="BFBFBF" w:sz="4"/>
-              <w:right w:val="single" w:color="BFBFBF" w:sz="4"/>
-            </w:tcBorders>
-            <w:shd w:fill="F2F2F2" w:color="auto" w:val="clear"/>
-            <w:tcMar>
-              <w:top w:type="dxa" w:w="70"/>
-              <w:left w:type="dxa" w:w="110"/>
-              <w:bottom w:type="dxa" w:w="70"/>
-              <w:right w:type="dxa" w:w="110"/>
-            </w:tcMar>
-          </w:tcPr>
-          <w:p>
-            <w:pPr>
-              <w:jc w:val="center"/>
-            </w:pPr>
-            <w:r>
-              <w:rPr>
-                <w:rFonts w:ascii="Calibri" w:cs="Calibri" w:eastAsia="Calibri" w:hAnsi="Calibri"/>
-                <w:b w:val="false"/>
-                <w:bCs w:val="false"/>
-                <w:sz w:val="20"/>
-                <w:szCs w:val="20"/>
-              </w:rPr>
-              <w:t xml:space="preserve">2</w:t>
-            </w:r>
-          </w:p>
-        </w:tc>
-        <w:tc>
-          <w:tcPr>
-            <w:tcW w:type="dxa" w:w="3200"/>
-            <w:tcBorders>
-              <w:top w:val="single" w:color="BFBFBF" w:sz="4"/>
-              <w:left w:val="single" w:color="BFBFBF" w:sz="4"/>
-              <w:bottom w:val="single" w:color="BFBFBF" w:sz="4"/>
-              <w:right w:val="single" w:color="BFBFBF" w:sz="4"/>
-            </w:tcBorders>
-            <w:shd w:fill="F2F2F2" w:color="auto" w:val="clear"/>
-            <w:tcMar>
-              <w:top w:type="dxa" w:w="70"/>
-              <w:left w:type="dxa" w:w="110"/>
-              <w:bottom w:type="dxa" w:w="70"/>
-              <w:right w:type="dxa" w:w="110"/>
-            </w:tcMar>
-          </w:tcPr>
-          <w:p>
-            <w:pPr>
-              <w:jc w:val="center"/>
-            </w:pPr>
-            <w:r>
-              <w:rPr>
-                <w:rFonts w:ascii="Calibri" w:cs="Calibri" w:eastAsia="Calibri" w:hAnsi="Calibri"/>
-                <w:b w:val="false"/>
-                <w:bCs w:val="false"/>
-                <w:sz w:val="20"/>
-                <w:szCs w:val="20"/>
-              </w:rPr>
-              <w:t xml:space="preserve">0,0346</w:t>
-            </w:r>
-          </w:p>
-        </w:tc>
-        <w:tc>
-          <w:tcPr>
-            <w:tcW w:type="dxa" w:w="3238"/>
-            <w:tcBorders>
-              <w:top w:val="single" w:color="BFBFBF" w:sz="4"/>
-              <w:left w:val="single" w:color="BFBFBF" w:sz="4"/>
-              <w:bottom w:val="single" w:color="BFBFBF" w:sz="4"/>
-              <w:right w:val="single" w:color="BFBFBF" w:sz="4"/>
-            </w:tcBorders>
-            <w:shd w:fill="F2F2F2" w:color="auto" w:val="clear"/>
-            <w:tcMar>
-              <w:top w:type="dxa" w:w="70"/>
-              <w:left w:type="dxa" w:w="110"/>
-              <w:bottom w:type="dxa" w:w="70"/>
-              <w:right w:type="dxa" w:w="110"/>
-            </w:tcMar>
-          </w:tcPr>
-          <w:p>
-            <w:pPr>
-              <w:jc w:val="center"/>
-            </w:pPr>
-            <w:r>
-              <w:rPr>
-                <w:rFonts w:ascii="Calibri" w:cs="Calibri" w:eastAsia="Calibri" w:hAnsi="Calibri"/>
-                <w:b w:val="false"/>
-                <w:bCs w:val="false"/>
-                <w:sz w:val="20"/>
-                <w:szCs w:val="20"/>
-              </w:rPr>
-              <w:t xml:space="preserve">identique à la référence</w:t>
-            </w:r>
-          </w:p>
-        </w:tc>
-      </w:tr>
-      <w:tr>
-        <w:tc>
-          <w:tcPr>
-            <w:tcW w:type="dxa" w:w="3200"/>
-            <w:tcBorders>
-              <w:top w:val="single" w:color="BFBFBF" w:sz="4"/>
-              <w:left w:val="single" w:color="BFBFBF" w:sz="4"/>
-              <w:bottom w:val="single" w:color="BFBFBF" w:sz="4"/>
-              <w:right w:val="single" w:color="BFBFBF" w:sz="4"/>
-            </w:tcBorders>
-            <w:tcMar>
-              <w:top w:type="dxa" w:w="70"/>
-              <w:left w:type="dxa" w:w="110"/>
-              <w:bottom w:type="dxa" w:w="70"/>
-              <w:right w:type="dxa" w:w="110"/>
-            </w:tcMar>
-          </w:tcPr>
-          <w:p>
-            <w:pPr>
-              <w:jc w:val="center"/>
-            </w:pPr>
-            <w:r>
-              <w:rPr>
-                <w:rFonts w:ascii="Calibri" w:cs="Calibri" w:eastAsia="Calibri" w:hAnsi="Calibri"/>
-                <w:b w:val="false"/>
-                <w:bCs w:val="false"/>
-                <w:sz w:val="20"/>
-                <w:szCs w:val="20"/>
-              </w:rPr>
-              <w:t xml:space="preserve">3</w:t>
-            </w:r>
-          </w:p>
-        </w:tc>
-        <w:tc>
-          <w:tcPr>
-            <w:tcW w:type="dxa" w:w="3200"/>
-            <w:tcBorders>
-              <w:top w:val="single" w:color="BFBFBF" w:sz="4"/>
-              <w:left w:val="single" w:color="BFBFBF" w:sz="4"/>
-              <w:bottom w:val="single" w:color="BFBFBF" w:sz="4"/>
-              <w:right w:val="single" w:color="BFBFBF" w:sz="4"/>
-            </w:tcBorders>
-            <w:tcMar>
-              <w:top w:type="dxa" w:w="70"/>
-              <w:left w:type="dxa" w:w="110"/>
-              <w:bottom w:type="dxa" w:w="70"/>
-              <w:right w:type="dxa" w:w="110"/>
-            </w:tcMar>
-          </w:tcPr>
-          <w:p>
-            <w:pPr>
-              <w:jc w:val="center"/>
-            </w:pPr>
-            <w:r>
-              <w:rPr>
-                <w:rFonts w:ascii="Calibri" w:cs="Calibri" w:eastAsia="Calibri" w:hAnsi="Calibri"/>
-                <w:b w:val="false"/>
-                <w:bCs w:val="false"/>
-                <w:sz w:val="20"/>
-                <w:szCs w:val="20"/>
-              </w:rPr>
-              <w:t xml:space="preserve">0,0384</w:t>
-            </w:r>
-          </w:p>
-        </w:tc>
-        <w:tc>
-          <w:tcPr>
-            <w:tcW w:type="dxa" w:w="3238"/>
-            <w:tcBorders>
-              <w:top w:val="single" w:color="BFBFBF" w:sz="4"/>
-              <w:left w:val="single" w:color="BFBFBF" w:sz="4"/>
-              <w:bottom w:val="single" w:color="BFBFBF" w:sz="4"/>
-              <w:right w:val="single" w:color="BFBFBF" w:sz="4"/>
-            </w:tcBorders>
-            <w:tcMar>
-              <w:top w:type="dxa" w:w="70"/>
-              <w:left w:type="dxa" w:w="110"/>
-              <w:bottom w:type="dxa" w:w="70"/>
-              <w:right w:type="dxa" w:w="110"/>
-            </w:tcMar>
-          </w:tcPr>
-          <w:p>
-            <w:pPr>
-              <w:jc w:val="center"/>
-            </w:pPr>
-            <w:r>
-              <w:rPr>
-                <w:rFonts w:ascii="Calibri" w:cs="Calibri" w:eastAsia="Calibri" w:hAnsi="Calibri"/>
-                <w:b w:val="false"/>
-                <w:bCs w:val="false"/>
-                <w:sz w:val="20"/>
-                <w:szCs w:val="20"/>
-              </w:rPr>
-              <w:t xml:space="preserve">identique à la référence</w:t>
-            </w:r>
-          </w:p>
-        </w:tc>
-      </w:tr>
-      <w:tr>
-        <w:tc>
-          <w:tcPr>
-            <w:tcW w:type="dxa" w:w="3200"/>
-            <w:tcBorders>
-              <w:top w:val="single" w:color="BFBFBF" w:sz="4"/>
-              <w:left w:val="single" w:color="BFBFBF" w:sz="4"/>
-              <w:bottom w:val="single" w:color="BFBFBF" w:sz="4"/>
-              <w:right w:val="single" w:color="BFBFBF" w:sz="4"/>
-            </w:tcBorders>
-            <w:shd w:fill="F2F2F2" w:color="auto" w:val="clear"/>
-            <w:tcMar>
-              <w:top w:type="dxa" w:w="70"/>
-              <w:left w:type="dxa" w:w="110"/>
-              <w:bottom w:type="dxa" w:w="70"/>
-              <w:right w:type="dxa" w:w="110"/>
-            </w:tcMar>
-          </w:tcPr>
-          <w:p>
-            <w:pPr>
-              <w:jc w:val="center"/>
-            </w:pPr>
-            <w:r>
-              <w:rPr>
-                <w:rFonts w:ascii="Calibri" w:cs="Calibri" w:eastAsia="Calibri" w:hAnsi="Calibri"/>
-                <w:b/>
-                <w:bCs/>
-              </w:rPr>
-              <w:t xml:space="preserve">Médiane</w:t>
-            </w:r>
-          </w:p>
-        </w:tc>
-        <w:tc>
-          <w:tcPr>
-            <w:tcW w:type="dxa" w:w="3200"/>
-            <w:tcBorders>
-              <w:top w:val="single" w:color="BFBFBF" w:sz="4"/>
-              <w:left w:val="single" w:color="BFBFBF" w:sz="4"/>
-              <w:bottom w:val="single" w:color="BFBFBF" w:sz="4"/>
-              <w:right w:val="single" w:color="BFBFBF" w:sz="4"/>
-            </w:tcBorders>
-            <w:shd w:fill="F2F2F2" w:color="auto" w:val="clear"/>
-            <w:tcMar>
-              <w:top w:type="dxa" w:w="70"/>
-              <w:left w:type="dxa" w:w="110"/>
-              <w:bottom w:type="dxa" w:w="70"/>
-              <w:right w:type="dxa" w:w="110"/>
-            </w:tcMar>
-          </w:tcPr>
-          <w:p>
-            <w:pPr>
-              <w:jc w:val="center"/>
-            </w:pPr>
-            <w:r>
-              <w:rPr>
-                <w:rFonts w:ascii="Calibri" w:cs="Calibri" w:eastAsia="Calibri" w:hAnsi="Calibri"/>
-                <w:b/>
-                <w:bCs/>
-              </w:rPr>
-              <w:t xml:space="preserve">0,0384</w:t>
-            </w:r>
-          </w:p>
-        </w:tc>
-        <w:tc>
-          <w:tcPr>
-            <w:tcW w:type="dxa" w:w="3238"/>
-            <w:tcBorders>
-              <w:top w:val="single" w:color="BFBFBF" w:sz="4"/>
-              <w:left w:val="single" w:color="BFBFBF" w:sz="4"/>
-              <w:bottom w:val="single" w:color="BFBFBF" w:sz="4"/>
-              <w:right w:val="single" w:color="BFBFBF" w:sz="4"/>
-            </w:tcBorders>
-            <w:shd w:fill="F2F2F2" w:color="auto" w:val="clear"/>
-            <w:tcMar>
-              <w:top w:type="dxa" w:w="70"/>
-              <w:left w:type="dxa" w:w="110"/>
-              <w:bottom w:type="dxa" w:w="70"/>
-              <w:right w:type="dxa" w:w="110"/>
-            </w:tcMar>
-          </w:tcPr>
-          <w:p>
-            <w:pPr>
-              <w:jc w:val="center"/>
-            </w:pPr>
-            <w:r>
-              <w:rPr>
-                <w:rFonts w:ascii="Calibri" w:cs="Calibri" w:eastAsia="Calibri" w:hAnsi="Calibri"/>
-                <w:b/>
-                <w:bCs/>
-              </w:rPr>
-              <w:t xml:space="preserve">speedup ≈ × 74 par rapport à T₁</w:t>
-            </w:r>
-          </w:p>
-        </w:tc>
-      </w:tr>
-    </w:tbl>
-    <w:p>
-      <w:pPr>
-        <w:spacing w:after="60"/>
-      </w:pPr>
-    </w:p>
-    <w:p>
-      <w:pPr>
-        <w:pStyle w:val="Heading2"/>
-      </w:pPr>
-      <w:r>
-        <w:rPr>
-          <w:rFonts w:ascii="Calibri" w:cs="Calibri" w:eastAsia="Calibri" w:hAnsi="Calibri"/>
-        </w:rPr>
-        <w:t xml:space="preserve">3.4 Analyse</w:t>
-      </w:r>
-    </w:p>
-    <w:p>
-      <w:pPr>
-        <w:pStyle w:val="ListParagraph"/>
-        <w:numPr>
-          <w:ilvl w:val="0"/>
-          <w:numId w:val="2"/>
-        </w:numPr>
-        <w:spacing w:after="60"/>
-      </w:pPr>
-      <w:r>
-        <w:rPr>
-          <w:rFonts w:ascii="Calibri" w:cs="Calibri" w:eastAsia="Calibri" w:hAnsi="Calibri"/>
-          <w:b/>
-          <w:bCs/>
-        </w:rPr>
-        <w:t xml:space="preserve">Toutes les fonctions profitent fortement de la vectorisation, </w:t>
-      </w:r>
-      <w:r>
-        <w:rPr>
-          <w:rFonts w:ascii="Calibri" w:cs="Calibri" w:eastAsia="Calibri" w:hAnsi="Calibri"/>
-        </w:rPr>
-        <w:t xml:space="preserve">avec des speedups de ×128 à ×172 sur cette machine.</w:t>
-      </w:r>
-    </w:p>
-    <w:p>
-      <w:pPr>
-        <w:pStyle w:val="ListParagraph"/>
-        <w:numPr>
-          <w:ilvl w:val="0"/>
-          <w:numId w:val="2"/>
-        </w:numPr>
-        <w:spacing w:after="60"/>
-      </w:pPr>
-      <w:r>
-        <w:rPr>
-          <w:rFonts w:ascii="Calibri" w:cs="Calibri" w:eastAsia="Calibri" w:hAnsi="Calibri"/>
-          <w:b/>
-          <w:bCs/>
-        </w:rPr>
-        <w:t xml:space="preserve">Le filtre est la fonction qui gagne le plus (×172), </w:t>
-      </w:r>
-      <w:r>
-        <w:rPr>
-          <w:rFonts w:ascii="Calibri" w:cs="Calibri" w:eastAsia="Calibri" w:hAnsi="Calibri"/>
-        </w:rPr>
-        <w:t xml:space="preserve">car c'est celle qui faisait le plus de travail dans l'interpréteur Python : 9 lectures par pixel. Avec NumPy, il ne reste que 9 opérations sur des tableaux entiers au lieu de 9 × 65 536 opérations Python par image.</w:t>
-      </w:r>
-    </w:p>
-    <w:p>
-      <w:pPr>
-        <w:pStyle w:val="ListParagraph"/>
-        <w:numPr>
-          <w:ilvl w:val="0"/>
-          <w:numId w:val="2"/>
-        </w:numPr>
-        <w:spacing w:after="60"/>
-      </w:pPr>
-      <w:r>
-        <w:rPr>
-          <w:rFonts w:ascii="Calibri" w:cs="Calibri" w:eastAsia="Calibri" w:hAnsi="Calibri"/>
-          <w:b/>
-          <w:bCs/>
-        </w:rPr>
-        <w:t xml:space="preserve">Pourquoi c'est plus rapide : </w:t>
-      </w:r>
-      <w:r>
-        <w:rPr>
-          <w:rFonts w:ascii="Calibri" w:cs="Calibri" w:eastAsia="Calibri" w:hAnsi="Calibri"/>
-        </w:rPr>
-        <w:t xml:space="preserve">les calculs sont exécutés en code compilé, sur des données contiguës en mémoire, sans le coût de l'interpréteur à chaque pixel. NumPy peut en plus utiliser les instructions SIMD du processeur.</w:t>
-      </w:r>
-    </w:p>
-    <w:p>
-      <w:pPr>
-        <w:pStyle w:val="ListParagraph"/>
-        <w:numPr>
-          <w:ilvl w:val="0"/>
-          <w:numId w:val="2"/>
-        </w:numPr>
-        <w:spacing w:after="60"/>
-      </w:pPr>
-      <w:r>
-        <w:rPr>
-          <w:rFonts w:ascii="Calibri" w:cs="Calibri" w:eastAsia="Calibri" w:hAnsi="Calibri"/>
-          <w:b/>
-          <w:bCs/>
-        </w:rPr>
-        <w:t xml:space="preserve">La vectorisation reste sur un seul cœur. </w:t>
-      </w:r>
-      <w:r>
-        <w:rPr>
-          <w:rFonts w:ascii="Calibri" w:cs="Calibri" w:eastAsia="Calibri" w:hAnsi="Calibri"/>
-        </w:rPr>
-        <w:t xml:space="preserve">Elle est complémentaire des parties 4 et 5 : les fonctions vectorisées peuvent être réutilisées dans les versions multiprocessing et MPI.</w:t>
-      </w:r>
-    </w:p>
-    <w:p>
-      <w:pPr>
-        <w:pStyle w:val="ListParagraph"/>
-        <w:numPr>
-          <w:ilvl w:val="0"/>
-          <w:numId w:val="2"/>
-        </w:numPr>
-        <w:spacing w:after="60"/>
-      </w:pPr>
-      <w:r>
-        <w:rPr>
-          <w:rFonts w:ascii="Calibri" w:cs="Calibri" w:eastAsia="Calibri" w:hAnsi="Calibri"/>
-          <w:b/>
-          <w:bCs/>
-        </w:rPr>
-        <w:t xml:space="preserve">Conséquence pour la suite : </w:t>
-      </w:r>
-      <w:r>
-        <w:rPr>
-          <w:rFonts w:ascii="Calibri" w:cs="Calibri" w:eastAsia="Calibri" w:hAnsi="Calibri"/>
-        </w:rPr>
-        <w:t xml:space="preserve">une fois vectorisé, le calcul ne prend plus que quelques millisecondes par image. Le chargement des fichiers et le coût de lancement des processus deviennent alors proportionnellement plus importants, ce qui limitera les gains du parallélisme.</w:t>
-      </w:r>
-    </w:p>
-    <w:p>
-      <w:pPr>
-        <w:pStyle w:val="ListParagraph"/>
-        <w:numPr>
-          <w:ilvl w:val="0"/>
-          <w:numId w:val="2"/>
-        </w:numPr>
-        <w:spacing w:after="60"/>
-      </w:pPr>
-      <w:r>
-        <w:rPr>
-          <w:rFonts w:ascii="Calibri" w:cs="Calibri" w:eastAsia="Calibri" w:hAnsi="Calibri"/>
-          <w:b/>
-          <w:bCs/>
-        </w:rPr>
-        <w:t xml:space="preserve">Le goulot change de place. </w:t>
-      </w:r>
-      <w:r>
-        <w:rPr>
-          <w:rFonts w:ascii="Calibri" w:cs="Calibri" w:eastAsia="Calibri" w:hAnsi="Calibri"/>
-        </w:rPr>
-        <w:t xml:space="preserve">Le pipeline complet est accéléré d'environ ×74, moins que les étapes de calcul seules (×163) : le chargement des fichiers, inchangé (≈ 16 ms), représente maintenant une part importante du temps restant, alors qu'il ne pesait que 0,3 % avant. Estimation à vérifier en mesurant le chargement seul ; c'est une piste pour le rôle 2 (threads pour les entrées-sorties).</w:t>
-      </w:r>
-    </w:p>
-    <w:p>
-      <w:r>
-        <w:br w:type="page"/>
-      </w:r>
-    </w:p>
-    <w:p>
-      <w:pPr>
-        <w:pStyle w:val="Heading1"/>
-      </w:pPr>
-      <w:r>
-        <w:rPr>
-          <w:rFonts w:ascii="Calibri" w:cs="Calibri" w:eastAsia="Calibri" w:hAnsi="Calibri"/>
-        </w:rPr>
-        <w:t xml:space="preserve">4. Partie 3 – Multithreading (Rôle 2)</w:t>
-      </w:r>
-    </w:p>
-    <w:p>
-      <w:pPr>
-        <w:spacing w:after="120" w:line="276"/>
-      </w:pPr>
-      <w:r>
-        <w:rPr>
-          <w:rFonts w:ascii="Calibri" w:cs="Calibri" w:eastAsia="Calibri" w:hAnsi="Calibri"/>
-        </w:rPr>
-        <w:t xml:space="preserve">Fichier : </w:t>
-      </w:r>
-      <w:r>
-        <w:rPr>
-          <w:rFonts w:ascii="Consolas" w:cs="Consolas" w:eastAsia="Consolas" w:hAnsi="Consolas"/>
-          <w:color w:val="1F3864"/>
-          <w:sz w:val="20"/>
-          <w:szCs w:val="20"/>
-        </w:rPr>
-        <w:t xml:space="preserve">threading_version.py</w:t>
-      </w:r>
-      <w:r>
-        <w:rPr>
-          <w:rFonts w:ascii="Calibri" w:cs="Calibri" w:eastAsia="Calibri" w:hAnsi="Calibri"/>
-        </w:rPr>
-        <w:t xml:space="preserve">. Responsable : </w:t>
-      </w:r>
-      <w:r>
-        <w:rPr>
-          <w:rFonts w:ascii="Calibri" w:cs="Calibri" w:eastAsia="Calibri" w:hAnsi="Calibri"/>
-          <w:i/>
-          <w:iCs/>
-          <w:color w:val="7F6000"/>
-          <w:shd w:fill="FFF59D" w:color="auto" w:val="clear"/>
-        </w:rPr>
-        <w:t xml:space="preserve">[À compléter – nom]</w:t>
-      </w:r>
-    </w:p>
-    <w:tbl>
-      <w:tblPr>
-        <w:tblW w:type="dxa" w:w="9638"/>
-        <w:tblBorders>
-          <w:top w:val="single" w:color="auto" w:sz="4"/>
-          <w:left w:val="single" w:color="auto" w:sz="4"/>
-          <w:bottom w:val="single" w:color="auto" w:sz="4"/>
-          <w:right w:val="single" w:color="auto" w:sz="4"/>
-          <w:insideH w:val="single" w:color="auto" w:sz="4"/>
-          <w:insideV w:val="single" w:color="auto" w:sz="4"/>
-        </w:tblBorders>
-      </w:tblPr>
-      <w:tblGrid>
-        <w:gridCol w:w="9638"/>
-      </w:tblGrid>
-      <w:tr>
-        <w:tc>
-          <w:tcPr>
-            <w:tcW w:type="dxa" w:w="9638"/>
-            <w:tcBorders>
-              <w:top w:val="single" w:color="BFBFBF" w:sz="4"/>
-              <w:left w:val="single" w:color="2E5597" w:sz="24"/>
-              <w:bottom w:val="single" w:color="BFBFBF" w:sz="4"/>
-              <w:right w:val="single" w:color="BFBFBF" w:sz="4"/>
-            </w:tcBorders>
-            <w:shd w:fill="DCE6F2" w:color="auto" w:val="clear"/>
-            <w:tcMar>
-              <w:top w:type="dxa" w:w="100"/>
-              <w:left w:type="dxa" w:w="180"/>
-              <w:bottom w:type="dxa" w:w="100"/>
-              <w:right w:type="dxa" w:w="180"/>
-            </w:tcMar>
-          </w:tcPr>
-          <w:p>
-            <w:pPr>
-              <w:spacing w:after="60"/>
-            </w:pPr>
-            <w:r>
-              <w:rPr>
-                <w:rFonts w:ascii="Calibri" w:cs="Calibri" w:eastAsia="Calibri" w:hAnsi="Calibri"/>
-                <w:b/>
-                <w:bCs/>
-                <w:color w:val="1F3864"/>
-              </w:rPr>
               <w:t xml:space="preserve">Ce que demande l'énoncé</w:t>
             </w:r>
           </w:p>
@@ -6580,7 +4202,7 @@
         <w:rPr>
           <w:rFonts w:ascii="Calibri" w:cs="Calibri" w:eastAsia="Calibri" w:hAnsi="Calibri"/>
         </w:rPr>
-        <w:t xml:space="preserve">4.1 Implémentation</w:t>
+        <w:t xml:space="preserve">3.1 Implémentation</w:t>
       </w:r>
     </w:p>
     <w:p>
@@ -6606,7 +4228,7 @@
         <w:rPr>
           <w:rFonts w:ascii="Calibri" w:cs="Calibri" w:eastAsia="Calibri" w:hAnsi="Calibri"/>
         </w:rPr>
-        <w:t xml:space="preserve">4.2 Résultats</w:t>
+        <w:t xml:space="preserve">3.2 Résultats</w:t>
       </w:r>
     </w:p>
     <w:tbl>
@@ -7310,7 +4932,7 @@
         <w:rPr>
           <w:rFonts w:ascii="Calibri" w:cs="Calibri" w:eastAsia="Calibri" w:hAnsi="Calibri"/>
         </w:rPr>
-        <w:t xml:space="preserve">4.3 Analyse</w:t>
+        <w:t xml:space="preserve">3.3 Analyse</w:t>
       </w:r>
     </w:p>
     <w:p>
@@ -7325,7 +4947,7 @@
           <w:color w:val="7F6000"/>
           <w:shd w:fill="FFF59D" w:color="auto" w:val="clear"/>
         </w:rPr>
-        <w:t xml:space="preserve">[À compléter – Rôle 2 : pourquoi les threads aident peu ou pas ici ? rôle du GIL ; rappel : le chargement ne représente que 0,3 % du temps (section 2.2)]</w:t>
+        <w:t xml:space="preserve">[À compléter – Rôle 2 : pourquoi les threads aident peu ou pas ici ? rôle du GIL ; rappel : le chargement ne représente que 0,3 % du temps (section 2.1)]</w:t>
       </w:r>
     </w:p>
     <w:p>
@@ -7357,7 +4979,7 @@
         <w:rPr>
           <w:rFonts w:ascii="Calibri" w:cs="Calibri" w:eastAsia="Calibri" w:hAnsi="Calibri"/>
         </w:rPr>
-        <w:t xml:space="preserve">5. Partie 4 – Multiprocessing (Rôle 3)</w:t>
+        <w:t xml:space="preserve">4. Partie 4 – Multiprocessing (Rôle 3)</w:t>
       </w:r>
     </w:p>
     <w:p>
@@ -7517,7 +5139,7 @@
         <w:rPr>
           <w:rFonts w:ascii="Calibri" w:cs="Calibri" w:eastAsia="Calibri" w:hAnsi="Calibri"/>
         </w:rPr>
-        <w:t xml:space="preserve">5.1 Implémentation</w:t>
+        <w:t xml:space="preserve">4.1 Implémentation</w:t>
       </w:r>
     </w:p>
     <w:p>
@@ -7543,7 +5165,7 @@
         <w:rPr>
           <w:rFonts w:ascii="Calibri" w:cs="Calibri" w:eastAsia="Calibri" w:hAnsi="Calibri"/>
         </w:rPr>
-        <w:t xml:space="preserve">5.2 Résultats</w:t>
+        <w:t xml:space="preserve">4.2 Résultats</w:t>
       </w:r>
     </w:p>
     <w:tbl>
@@ -8247,7 +5869,7 @@
         <w:rPr>
           <w:rFonts w:ascii="Calibri" w:cs="Calibri" w:eastAsia="Calibri" w:hAnsi="Calibri"/>
         </w:rPr>
-        <w:t xml:space="preserve">5.3 Analyse</w:t>
+        <w:t xml:space="preserve">4.3 Analyse</w:t>
       </w:r>
     </w:p>
     <w:p>
@@ -8278,7 +5900,7 @@
         <w:rPr>
           <w:rFonts w:ascii="Calibri" w:cs="Calibri" w:eastAsia="Calibri" w:hAnsi="Calibri"/>
         </w:rPr>
-        <w:t xml:space="preserve">6. Partie 5 – MPI (Rôle 4)</w:t>
+        <w:t xml:space="preserve">5. Partie 5 – MPI (Rôle 4)</w:t>
       </w:r>
     </w:p>
     <w:p>
@@ -8406,7 +6028,7 @@
         <w:rPr>
           <w:rFonts w:ascii="Calibri" w:cs="Calibri" w:eastAsia="Calibri" w:hAnsi="Calibri"/>
         </w:rPr>
-        <w:t xml:space="preserve">6.1 Implémentation</w:t>
+        <w:t xml:space="preserve">5.1 Implémentation</w:t>
       </w:r>
     </w:p>
     <w:p>
@@ -8432,7 +6054,7 @@
         <w:rPr>
           <w:rFonts w:ascii="Calibri" w:cs="Calibri" w:eastAsia="Calibri" w:hAnsi="Calibri"/>
         </w:rPr>
-        <w:t xml:space="preserve">6.2 Résultats</w:t>
+        <w:t xml:space="preserve">5.2 Résultats</w:t>
       </w:r>
     </w:p>
     <w:p>
@@ -9156,7 +6778,7 @@
         <w:rPr>
           <w:rFonts w:ascii="Calibri" w:cs="Calibri" w:eastAsia="Calibri" w:hAnsi="Calibri"/>
         </w:rPr>
-        <w:t xml:space="preserve">6.3 Analyse</w:t>
+        <w:t xml:space="preserve">5.3 Analyse</w:t>
       </w:r>
     </w:p>
     <w:p>
@@ -9187,7 +6809,7 @@
         <w:rPr>
           <w:rFonts w:ascii="Calibri" w:cs="Calibri" w:eastAsia="Calibri" w:hAnsi="Calibri"/>
         </w:rPr>
-        <w:t xml:space="preserve">7. Comparaison des versions</w:t>
+        <w:t xml:space="preserve">6. Comparaison des versions</w:t>
       </w:r>
     </w:p>
     <w:p>
@@ -10193,7 +7815,7 @@
         <w:rPr>
           <w:rFonts w:ascii="Calibri" w:cs="Calibri" w:eastAsia="Calibri" w:hAnsi="Calibri"/>
         </w:rPr>
-        <w:t xml:space="preserve">8. Conclusion</w:t>
+        <w:t xml:space="preserve">7. Conclusion</w:t>
       </w:r>
     </w:p>
     <w:tbl>
@@ -10278,7 +7900,7 @@
           <w:color w:val="7F6000"/>
           <w:shd w:fill="FFF59D" w:color="auto" w:val="clear"/>
         </w:rPr>
-        <w:t xml:space="preserve">[À compléter – équipe, une fois le tableau de la section 7 rempli]</w:t>
+        <w:t xml:space="preserve">[À compléter – équipe, une fois le tableau de la section 6 rempli]</w:t>
       </w:r>
     </w:p>
     <w:p>

</xml_diff>

<commit_message>
Compte rendu : ajout de la partie MPI de Kylian
</commit_message>
<xml_diff>
--- a/Compte_rendu_projet_HPC.docx
+++ b/Compte_rendu_projet_HPC.docx
@@ -577,12 +577,12 @@
             <w:r>
               <w:rPr>
                 <w:rFonts w:ascii="Calibri" w:cs="Calibri" w:eastAsia="Calibri" w:hAnsi="Calibri"/>
-                <w:i/>
-                <w:iCs/>
-                <w:color w:val="7F6000"/>
-                <w:shd w:fill="FFF59D" w:color="auto" w:val="clear"/>
-              </w:rPr>
-              <w:t xml:space="preserve">[À compléter – nom]</w:t>
+                <w:b w:val="false"/>
+                <w:bCs w:val="false"/>
+                <w:sz w:val="20"/>
+                <w:szCs w:val="20"/>
+              </w:rPr>
+              <w:t xml:space="preserve">Kylian Payan</w:t>
             </w:r>
           </w:p>
         </w:tc>
@@ -1833,7 +1833,7 @@
                 <w:sz w:val="20"/>
                 <w:szCs w:val="20"/>
               </w:rPr>
-              <w:t xml:space="preserve">Partie 5 – MPI</w:t>
+              <w:t xml:space="preserve">Partie 5 – MPI (weak scaling à faire)</w:t>
             </w:r>
           </w:p>
         </w:tc>
@@ -1866,7 +1866,7 @@
                 <w:sz w:val="20"/>
                 <w:szCs w:val="20"/>
               </w:rPr>
-              <w:t xml:space="preserve">Rôle 4</w:t>
+              <w:t xml:space="preserve">Rôle 4 (Kylian)</w:t>
             </w:r>
           </w:p>
         </w:tc>
@@ -1912,7 +1912,7 @@
               <w:bottom w:val="single" w:color="BFBFBF" w:sz="4"/>
               <w:right w:val="single" w:color="BFBFBF" w:sz="4"/>
             </w:tcBorders>
-            <w:shd w:fill="FFF2CC" w:color="auto" w:val="clear"/>
+            <w:shd w:fill="FCE4D6" w:color="auto" w:val="clear"/>
             <w:tcMar>
               <w:top w:type="dxa" w:w="70"/>
               <w:left w:type="dxa" w:w="110"/>
@@ -1929,11 +1929,11 @@
                 <w:rFonts w:ascii="Calibri" w:cs="Calibri" w:eastAsia="Calibri" w:hAnsi="Calibri"/>
                 <w:b/>
                 <w:bCs/>
-                <w:color w:val="7F6000"/>
-                <w:sz w:val="20"/>
-                <w:szCs w:val="20"/>
-              </w:rPr>
-              <w:t xml:space="preserve">À faire</w:t>
+                <w:color w:val="843C0C"/>
+                <w:sz w:val="20"/>
+                <w:szCs w:val="20"/>
+              </w:rPr>
+              <w:t xml:space="preserve">En cours</w:t>
             </w:r>
           </w:p>
         </w:tc>
@@ -5926,17 +5926,7 @@
         <w:rPr>
           <w:rFonts w:ascii="Calibri" w:cs="Calibri" w:eastAsia="Calibri" w:hAnsi="Calibri"/>
         </w:rPr>
-        <w:t xml:space="preserve">. Responsable : </w:t>
-      </w:r>
-      <w:r>
-        <w:rPr>
-          <w:rFonts w:ascii="Calibri" w:cs="Calibri" w:eastAsia="Calibri" w:hAnsi="Calibri"/>
-          <w:i/>
-          <w:iCs/>
-          <w:color w:val="7F6000"/>
-          <w:shd w:fill="FFF59D" w:color="auto" w:val="clear"/>
-        </w:rPr>
-        <w:t xml:space="preserve">[À compléter – nom]</w:t>
+        <w:t xml:space="preserve">. Responsable : Kylian Payan.</w:t>
       </w:r>
     </w:p>
     <w:tbl>
@@ -6038,12 +6028,8 @@
       <w:r>
         <w:rPr>
           <w:rFonts w:ascii="Calibri" w:cs="Calibri" w:eastAsia="Calibri" w:hAnsi="Calibri"/>
-          <w:i/>
-          <w:iCs/>
-          <w:color w:val="7F6000"/>
-          <w:shd w:fill="FFF59D" w:color="auto" w:val="clear"/>
-        </w:rPr>
-        <w:t xml:space="preserve">[À compléter – Rôle 4 : répartition des images entre rangs, fonctions MPI utilisées et à quoi elles servent]</w:t>
+        </w:rPr>
+        <w:t xml:space="preserve">J'ai réparti les 24 images entre les processus MPI. Le rang 0 prépare les groupes et les envoie avec scatter(). bcast() partage le nombre d'images. Chaque processus traite ses images de son côté. Ensuite, gather() rassemble les résultats et reduce() récupère le nombre d'images traitées et le temps le plus long. Le rang 0 enregistre le CSV. J'ai gardé les fonctions du programme séquentiel pour obtenir les mêmes résultats.</w:t>
       </w:r>
     </w:p>
     <w:p>
@@ -6059,23 +6045,14 @@
     </w:p>
     <w:p>
       <w:pPr>
-        <w:shd w:fill="F2F2F2" w:color="auto" w:val="clear"/>
-        <w:spacing w:after="0"/>
-        <w:ind w:left="200"/>
-      </w:pPr>
-      <w:r>
-        <w:rPr>
-          <w:rFonts w:ascii="Consolas" w:cs="Consolas" w:eastAsia="Consolas" w:hAnsi="Consolas"/>
-          <w:sz w:val="19"/>
-          <w:szCs w:val="19"/>
-        </w:rPr>
-        <w:t xml:space="preserve">mpiexec -n 4 python mpi_version.py</w:t>
-      </w:r>
-    </w:p>
-    <w:p>
-      <w:pPr>
-        <w:spacing w:after="60"/>
-      </w:pPr>
+        <w:spacing w:after="120" w:line="276"/>
+      </w:pPr>
+      <w:r>
+        <w:rPr>
+          <w:rFonts w:ascii="Calibri" w:cs="Calibri" w:eastAsia="Calibri" w:hAnsi="Calibri"/>
+        </w:rPr>
+        <w:t xml:space="preserve">J'ai lancé le programme avec 1, 2, 4 et 8 processus, en répétant chaque test 3 fois avec la commande mpiexec -n 4 python mpi_version.py --repeat 3 (ici pour 4 processus).</w:t>
+      </w:r>
     </w:p>
     <w:tbl>
       <w:tblPr>
@@ -6297,7 +6274,7 @@
                 <w:sz w:val="20"/>
                 <w:szCs w:val="20"/>
               </w:rPr>
-              <w:t xml:space="preserve"/>
+              <w:t xml:space="preserve">3,549323</w:t>
             </w:r>
           </w:p>
         </w:tc>
@@ -6329,7 +6306,7 @@
                 <w:sz w:val="20"/>
                 <w:szCs w:val="20"/>
               </w:rPr>
-              <w:t xml:space="preserve"/>
+              <w:t xml:space="preserve">1,00</w:t>
             </w:r>
           </w:p>
         </w:tc>
@@ -6361,7 +6338,7 @@
                 <w:sz w:val="20"/>
                 <w:szCs w:val="20"/>
               </w:rPr>
-              <w:t xml:space="preserve"/>
+              <w:t xml:space="preserve">100 %</w:t>
             </w:r>
           </w:p>
         </w:tc>
@@ -6429,7 +6406,7 @@
                 <w:sz w:val="20"/>
                 <w:szCs w:val="20"/>
               </w:rPr>
-              <w:t xml:space="preserve"/>
+              <w:t xml:space="preserve">1,754376</w:t>
             </w:r>
           </w:p>
         </w:tc>
@@ -6462,7 +6439,7 @@
                 <w:sz w:val="20"/>
                 <w:szCs w:val="20"/>
               </w:rPr>
-              <w:t xml:space="preserve"/>
+              <w:t xml:space="preserve">2,02</w:t>
             </w:r>
           </w:p>
         </w:tc>
@@ -6495,7 +6472,7 @@
                 <w:sz w:val="20"/>
                 <w:szCs w:val="20"/>
               </w:rPr>
-              <w:t xml:space="preserve"/>
+              <w:t xml:space="preserve">101,15 %</w:t>
             </w:r>
           </w:p>
         </w:tc>
@@ -6561,7 +6538,7 @@
                 <w:sz w:val="20"/>
                 <w:szCs w:val="20"/>
               </w:rPr>
-              <w:t xml:space="preserve"/>
+              <w:t xml:space="preserve">0,876615</w:t>
             </w:r>
           </w:p>
         </w:tc>
@@ -6593,7 +6570,7 @@
                 <w:sz w:val="20"/>
                 <w:szCs w:val="20"/>
               </w:rPr>
-              <w:t xml:space="preserve"/>
+              <w:t xml:space="preserve">4,05</w:t>
             </w:r>
           </w:p>
         </w:tc>
@@ -6625,7 +6602,7 @@
                 <w:sz w:val="20"/>
                 <w:szCs w:val="20"/>
               </w:rPr>
-              <w:t xml:space="preserve"/>
+              <w:t xml:space="preserve">101,23 %</w:t>
             </w:r>
           </w:p>
         </w:tc>
@@ -6693,7 +6670,7 @@
                 <w:sz w:val="20"/>
                 <w:szCs w:val="20"/>
               </w:rPr>
-              <w:t xml:space="preserve"/>
+              <w:t xml:space="preserve">0,599465</w:t>
             </w:r>
           </w:p>
         </w:tc>
@@ -6726,7 +6703,7 @@
                 <w:sz w:val="20"/>
                 <w:szCs w:val="20"/>
               </w:rPr>
-              <w:t xml:space="preserve"/>
+              <w:t xml:space="preserve">5,92</w:t>
             </w:r>
           </w:p>
         </w:tc>
@@ -6759,7 +6736,7 @@
                 <w:sz w:val="20"/>
                 <w:szCs w:val="20"/>
               </w:rPr>
-              <w:t xml:space="preserve"/>
+              <w:t xml:space="preserve">74,01 %</w:t>
             </w:r>
           </w:p>
         </w:tc>
@@ -6772,6 +6749,17 @@
     </w:p>
     <w:p>
       <w:pPr>
+        <w:spacing w:after="120" w:line="276"/>
+      </w:pPr>
+      <w:r>
+        <w:rPr>
+          <w:rFonts w:ascii="Calibri" w:cs="Calibri" w:eastAsia="Calibri" w:hAnsi="Calibri"/>
+        </w:rPr>
+        <w:t xml:space="preserve">Sur les 24 images, le temps passe de 3,55 s avec 1 processus à 0,60 s avec 8. Les statistiques restent identiques à la référence : moyenne 0,46763534, maximum 1, 145595 pixels au-dessus du seuil et fraction moyenne 0,09256681.</w:t>
+      </w:r>
+    </w:p>
+    <w:p>
+      <w:pPr>
         <w:pStyle w:val="Heading2"/>
       </w:pPr>
       <w:r>
@@ -6788,12 +6776,8 @@
       <w:r>
         <w:rPr>
           <w:rFonts w:ascii="Calibri" w:cs="Calibri" w:eastAsia="Calibri" w:hAnsi="Calibri"/>
-          <w:i/>
-          <w:iCs/>
-          <w:color w:val="7F6000"/>
-          <w:shd w:fill="FFF59D" w:color="auto" w:val="clear"/>
-        </w:rPr>
-        <w:t xml:space="preserve">[À compléter – Rôle 4 : scaling fort (même jeu de données, plus de rangs) et faible (plus d'images quand on ajoute des rangs) ; coût des communications]</w:t>
+        </w:rPr>
+        <w:t xml:space="preserve">Le strong scaling est bon : en gardant les mêmes 24 images, le temps diminue quand on ajoute des processus. Avec 4 processus, le speedup est de 4,05. Avec 8, il atteint 5,92, mais l'efficacité descend à 74 % : les communications et le partage des ressources limitent le gain. Pour le weak scaling, il faudrait tester 24, 48, 96 puis 192 images avec 1, 2, 4 puis 8 processus. Je n'ai pas encore fait ces mesures.</w:t>
       </w:r>
     </w:p>
     <w:p>
@@ -8369,7 +8353,7 @@
         <w:rPr>
           <w:rFonts w:ascii="Calibri" w:cs="Calibri" w:eastAsia="Calibri" w:hAnsi="Calibri"/>
         </w:rPr>
-        <w:t xml:space="preserve">Rôle 4 – MPI</w:t>
+        <w:t xml:space="preserve">Rôle 4 – Kylian Payan (MPI)</w:t>
       </w:r>
     </w:p>
     <w:p>
@@ -8392,12 +8376,8 @@
       <w:r>
         <w:rPr>
           <w:rFonts w:ascii="Calibri" w:cs="Calibri" w:eastAsia="Calibri" w:hAnsi="Calibri"/>
-          <w:i/>
-          <w:iCs/>
-          <w:color w:val="7F6000"/>
-          <w:shd w:fill="FFF59D" w:color="auto" w:val="clear"/>
-        </w:rPr>
-        <w:t xml:space="preserve">[À compléter – Rôle 4]</w:t>
+        </w:rPr>
+        <w:t xml:space="preserve">j'ai créé mpi_version.py pour répartir les images entre les processus et rassembler les résultats avec mpi4py.</w:t>
       </w:r>
     </w:p>
     <w:p>
@@ -8420,12 +8400,8 @@
       <w:r>
         <w:rPr>
           <w:rFonts w:ascii="Calibri" w:cs="Calibri" w:eastAsia="Calibri" w:hAnsi="Calibri"/>
-          <w:i/>
-          <w:iCs/>
-          <w:color w:val="7F6000"/>
-          <w:shd w:fill="FFF59D" w:color="auto" w:val="clear"/>
-        </w:rPr>
-        <w:t xml:space="preserve">[À compléter – Rôle 4]</w:t>
+        </w:rPr>
+        <w:t xml:space="preserve">j'ai testé 1, 2, 4 et 8 processus sur 24 images, avec 3 répétitions à chaque fois.</w:t>
       </w:r>
     </w:p>
     <w:p>
@@ -8448,12 +8424,8 @@
       <w:r>
         <w:rPr>
           <w:rFonts w:ascii="Calibri" w:cs="Calibri" w:eastAsia="Calibri" w:hAnsi="Calibri"/>
-          <w:i/>
-          <w:iCs/>
-          <w:color w:val="7F6000"/>
-          <w:shd w:fill="FFF59D" w:color="auto" w:val="clear"/>
-        </w:rPr>
-        <w:t xml:space="preserve">[À compléter – Rôle 4]</w:t>
+        </w:rPr>
+        <w:t xml:space="preserve">le temps passe de 3,55 s à 0,60 s, soit un speedup de 5,92 avec 8 processus. Les résultats sont identiques à la référence.</w:t>
       </w:r>
     </w:p>
     <w:p>
@@ -8476,12 +8448,8 @@
       <w:r>
         <w:rPr>
           <w:rFonts w:ascii="Calibri" w:cs="Calibri" w:eastAsia="Calibri" w:hAnsi="Calibri"/>
-          <w:i/>
-          <w:iCs/>
-          <w:color w:val="7F6000"/>
-          <w:shd w:fill="FFF59D" w:color="auto" w:val="clear"/>
-        </w:rPr>
-        <w:t xml:space="preserve">[À compléter – Rôle 4]</w:t>
+        </w:rPr>
+        <w:t xml:space="preserve">utiliser MPI pour partager le travail et comprendre pourquoi ajouter des processus ne donne pas toujours un gain proportionnel.</w:t>
       </w:r>
     </w:p>
     <w:p>

</xml_diff>